<commit_message>
[research/ui-ux-pro-max-skill] Buoc 3b: Bang de xuat cai tien KZTEK (Mode A)
- Cap nhat mode: A (da xac nhan)
- Them Muc 9: 5 de xuat E1-E5 day du cot theo quy trinh WF-GITHUB-RESEARCH
  E1: Cai skill UI UX Pro Max vao workspace Claude Code
  E2: Tich hop Design System Generator vao ui-ux-designer.md
  E3: Chuan hoa Avalonia lessons thanh CSV searchable
  E4: Bo sung KZTEK brand palette vao design-system MASTER template
  E5: Them huong dan query design database vao design-taste-frontend.md
- Cap nhat DOCX + PDF

Plan: docs/research/RESEARCH-ui-ux-pro-max-skill-2026-08-04.md
</commit_message>
<xml_diff>
--- a/docs/research/RESEARCH-ui-ux-pro-max-skill-2026-08-04.docx
+++ b/docs/research/RESEARCH-ui-ux-pro-max-skill-2026-08-04.docx
@@ -73,7 +73,7 @@
         <w:rPr>
           <w:sz w:val="21"/>
         </w:rPr>
-        <w:t>mode: pending — chờ user xác nhận Mode A/B</w:t>
+        <w:t>mode: A (Cải tiến KZTEK — đã xác nhận)</w:t>
       </w:r>
     </w:p>
     <w:p>
@@ -84,7 +84,7 @@
         <w:rPr>
           <w:sz w:val="21"/>
         </w:rPr>
-        <w:t>status: draft — phân tích Bước 3 (chưa có đề xuất)</w:t>
+        <w:t>status: draft — Bước 3b (bảng đề xuất, chờ user duyệt Bước 4)</w:t>
       </w:r>
     </w:p>
     <w:p>
@@ -4533,15 +4533,2450 @@
           <w:b/>
           <w:color w:val="4A3F8C"/>
         </w:rPr>
-        <w:t>Cần user xác nhận:</w:t>
+        <w:t>Mode A đã được xác nhận.</w:t>
       </w:r>
       <w:r>
         <w:rPr>
           <w:color w:val="4A3F8C"/>
         </w:rPr>
-        <w:t xml:space="preserve"> Bước tiếp theo phụ thuộc vào mục đích nghiên cứu. Xem phần "Bước tiếp theo" ở cuối báo cáo gốc.</w:t>
+        <w:t xml:space="preserve"> Bảng đề xuất cải tiến bên dưới (Bước 3b) — chờ user duyệt từng mục ở Bước 4 trước khi áp dụng bất kỳ thay đổi nào.</w:t>
       </w:r>
     </w:p>
+    <w:p>
+      <w:pPr>
+        <w:pBdr>
+          <w:bottom w:val="single" w:sz="6" w:space="1" w:color="F05922"/>
+        </w:pBdr>
+        <w:spacing w:after="120"/>
+      </w:pPr>
+    </w:p>
+    <w:p>
+      <w:pPr>
+        <w:pStyle w:val="Heading2"/>
+        <w:spacing w:before="200" w:after="80"/>
+      </w:pPr>
+      <w:r>
+        <w:rPr>
+          <w:color w:val="F05922"/>
+          <w:sz w:val="28"/>
+        </w:rPr>
+        <w:t>9. Bảng đề xuất cải tiến KZTEK (Bước 3b — Mode A)</w:t>
+      </w:r>
+    </w:p>
+    <w:p>
+      <w:pPr>
+        <w:spacing w:before="40" w:after="40"/>
+        <w:ind w:left="567"/>
+        <w:pBdr>
+          <w:left w:val="single" w:sz="12" w:space="10" w:color="F05922"/>
+        </w:pBdr>
+      </w:pPr>
+      <w:r>
+        <w:rPr>
+          <w:color w:val="4A3F8C"/>
+        </w:rPr>
+        <w:t>Mỗi đề xuất dựa trực tiếp trên phần "So sánh" ở Mục 6. Không có đề xuất nào được áp dụng cho đến khi user xác nhận ở Bước 4.</w:t>
+      </w:r>
+    </w:p>
+    <w:tbl>
+      <w:tblPr>
+        <w:tblStyle w:val="TableGrid"/>
+        <w:tblW w:type="auto" w:w="0"/>
+        <w:tblLook w:firstColumn="1" w:firstRow="1" w:lastColumn="0" w:lastRow="0" w:noHBand="0" w:noVBand="1" w:val="04A0"/>
+      </w:tblPr>
+      <w:tblGrid>
+        <w:gridCol w:w="1211"/>
+        <w:gridCol w:w="1211"/>
+        <w:gridCol w:w="1211"/>
+        <w:gridCol w:w="1211"/>
+        <w:gridCol w:w="1211"/>
+        <w:gridCol w:w="1211"/>
+        <w:gridCol w:w="1211"/>
+        <w:gridCol w:w="1211"/>
+      </w:tblGrid>
+      <w:tr>
+        <w:tc>
+          <w:tcPr>
+            <w:tcW w:type="dxa" w:w="1211"/>
+            <w:shd w:val="clear" w:color="auto" w:fill="251C53"/>
+            <w:tcBorders>
+              <w:top w:val="single" w:sz="4" w:space="0" w:color="251C53"/>
+              <w:left w:val="single" w:sz="4" w:space="0" w:color="251C53"/>
+              <w:bottom w:val="single" w:sz="4" w:space="0" w:color="251C53"/>
+              <w:right w:val="single" w:sz="4" w:space="0" w:color="251C53"/>
+            </w:tcBorders>
+          </w:tcPr>
+          <w:p>
+            <w:r>
+              <w:rPr>
+                <w:b/>
+                <w:color w:val="FFFFFF"/>
+                <w:sz w:val="20"/>
+              </w:rPr>
+              <w:t>#</w:t>
+            </w:r>
+          </w:p>
+        </w:tc>
+        <w:tc>
+          <w:tcPr>
+            <w:tcW w:type="dxa" w:w="1211"/>
+            <w:shd w:val="clear" w:color="auto" w:fill="251C53"/>
+            <w:tcBorders>
+              <w:top w:val="single" w:sz="4" w:space="0" w:color="251C53"/>
+              <w:left w:val="single" w:sz="4" w:space="0" w:color="251C53"/>
+              <w:bottom w:val="single" w:sz="4" w:space="0" w:color="251C53"/>
+              <w:right w:val="single" w:sz="4" w:space="0" w:color="251C53"/>
+            </w:tcBorders>
+          </w:tcPr>
+          <w:p>
+            <w:r>
+              <w:rPr>
+                <w:b/>
+                <w:color w:val="FFFFFF"/>
+                <w:sz w:val="20"/>
+              </w:rPr>
+              <w:t>Đề xuất</w:t>
+            </w:r>
+          </w:p>
+        </w:tc>
+        <w:tc>
+          <w:tcPr>
+            <w:tcW w:type="dxa" w:w="1211"/>
+            <w:shd w:val="clear" w:color="auto" w:fill="251C53"/>
+            <w:tcBorders>
+              <w:top w:val="single" w:sz="4" w:space="0" w:color="251C53"/>
+              <w:left w:val="single" w:sz="4" w:space="0" w:color="251C53"/>
+              <w:bottom w:val="single" w:sz="4" w:space="0" w:color="251C53"/>
+              <w:right w:val="single" w:sz="4" w:space="0" w:color="251C53"/>
+            </w:tcBorders>
+          </w:tcPr>
+          <w:p>
+            <w:r>
+              <w:rPr>
+                <w:b/>
+                <w:color w:val="FFFFFF"/>
+                <w:sz w:val="20"/>
+              </w:rPr>
+              <w:t>Hiện trạng KZTEK (đang có gì / chưa có gì)</w:t>
+            </w:r>
+          </w:p>
+        </w:tc>
+        <w:tc>
+          <w:tcPr>
+            <w:tcW w:type="dxa" w:w="1211"/>
+            <w:shd w:val="clear" w:color="auto" w:fill="251C53"/>
+            <w:tcBorders>
+              <w:top w:val="single" w:sz="4" w:space="0" w:color="251C53"/>
+              <w:left w:val="single" w:sz="4" w:space="0" w:color="251C53"/>
+              <w:bottom w:val="single" w:sz="4" w:space="0" w:color="251C53"/>
+              <w:right w:val="single" w:sz="4" w:space="0" w:color="251C53"/>
+            </w:tcBorders>
+          </w:tcPr>
+          <w:p>
+            <w:r>
+              <w:rPr>
+                <w:b/>
+                <w:color w:val="FFFFFF"/>
+                <w:sz w:val="20"/>
+              </w:rPr>
+              <w:t>Học từ đâu (file/pattern cụ thể trong repo nguồn)</w:t>
+            </w:r>
+          </w:p>
+        </w:tc>
+        <w:tc>
+          <w:tcPr>
+            <w:tcW w:type="dxa" w:w="1211"/>
+            <w:shd w:val="clear" w:color="auto" w:fill="251C53"/>
+            <w:tcBorders>
+              <w:top w:val="single" w:sz="4" w:space="0" w:color="251C53"/>
+              <w:left w:val="single" w:sz="4" w:space="0" w:color="251C53"/>
+              <w:bottom w:val="single" w:sz="4" w:space="0" w:color="251C53"/>
+              <w:right w:val="single" w:sz="4" w:space="0" w:color="251C53"/>
+            </w:tcBorders>
+          </w:tcPr>
+          <w:p>
+            <w:r>
+              <w:rPr>
+                <w:b/>
+                <w:color w:val="FFFFFF"/>
+                <w:sz w:val="20"/>
+              </w:rPr>
+              <w:t>Lý do thay đổi (vấn đề/khoảng trống cụ thể)</w:t>
+            </w:r>
+          </w:p>
+        </w:tc>
+        <w:tc>
+          <w:tcPr>
+            <w:tcW w:type="dxa" w:w="1211"/>
+            <w:shd w:val="clear" w:color="auto" w:fill="251C53"/>
+            <w:tcBorders>
+              <w:top w:val="single" w:sz="4" w:space="0" w:color="251C53"/>
+              <w:left w:val="single" w:sz="4" w:space="0" w:color="251C53"/>
+              <w:bottom w:val="single" w:sz="4" w:space="0" w:color="251C53"/>
+              <w:right w:val="single" w:sz="4" w:space="0" w:color="251C53"/>
+            </w:tcBorders>
+          </w:tcPr>
+          <w:p>
+            <w:r>
+              <w:rPr>
+                <w:b/>
+                <w:color w:val="FFFFFF"/>
+                <w:sz w:val="20"/>
+              </w:rPr>
+              <w:t>Áp dụng vào đâu trong KZTEK</w:t>
+            </w:r>
+          </w:p>
+        </w:tc>
+        <w:tc>
+          <w:tcPr>
+            <w:tcW w:type="dxa" w:w="1211"/>
+            <w:shd w:val="clear" w:color="auto" w:fill="251C53"/>
+            <w:tcBorders>
+              <w:top w:val="single" w:sz="4" w:space="0" w:color="251C53"/>
+              <w:left w:val="single" w:sz="4" w:space="0" w:color="251C53"/>
+              <w:bottom w:val="single" w:sz="4" w:space="0" w:color="251C53"/>
+              <w:right w:val="single" w:sz="4" w:space="0" w:color="251C53"/>
+            </w:tcBorders>
+          </w:tcPr>
+          <w:p>
+            <w:r>
+              <w:rPr>
+                <w:b/>
+                <w:color w:val="FFFFFF"/>
+                <w:sz w:val="20"/>
+              </w:rPr>
+              <w:t>Đạt được gì (kết quả cụ thể, quan sát được)</w:t>
+            </w:r>
+          </w:p>
+        </w:tc>
+        <w:tc>
+          <w:tcPr>
+            <w:tcW w:type="dxa" w:w="1211"/>
+            <w:shd w:val="clear" w:color="auto" w:fill="251C53"/>
+            <w:tcBorders>
+              <w:top w:val="single" w:sz="4" w:space="0" w:color="251C53"/>
+              <w:left w:val="single" w:sz="4" w:space="0" w:color="251C53"/>
+              <w:bottom w:val="single" w:sz="4" w:space="0" w:color="251C53"/>
+              <w:right w:val="single" w:sz="4" w:space="0" w:color="251C53"/>
+            </w:tcBorders>
+          </w:tcPr>
+          <w:p>
+            <w:r>
+              <w:rPr>
+                <w:b/>
+                <w:color w:val="FFFFFF"/>
+                <w:sz w:val="20"/>
+              </w:rPr>
+              <w:t>Rủi ro / Effort</w:t>
+            </w:r>
+          </w:p>
+        </w:tc>
+      </w:tr>
+      <w:tr>
+        <w:tc>
+          <w:tcPr>
+            <w:tcW w:type="dxa" w:w="1211"/>
+            <w:tcBorders>
+              <w:top w:val="single" w:sz="4" w:space="0" w:color="CBCBCB"/>
+              <w:left w:val="single" w:sz="4" w:space="0" w:color="CBCBCB"/>
+              <w:bottom w:val="single" w:sz="4" w:space="0" w:color="CBCBCB"/>
+              <w:right w:val="single" w:sz="4" w:space="0" w:color="CBCBCB"/>
+            </w:tcBorders>
+          </w:tcPr>
+          <w:p>
+            <w:r>
+              <w:rPr>
+                <w:sz w:val="20"/>
+              </w:rPr>
+              <w:t>---</w:t>
+            </w:r>
+          </w:p>
+        </w:tc>
+        <w:tc>
+          <w:tcPr>
+            <w:tcW w:type="dxa" w:w="1211"/>
+            <w:tcBorders>
+              <w:top w:val="single" w:sz="4" w:space="0" w:color="CBCBCB"/>
+              <w:left w:val="single" w:sz="4" w:space="0" w:color="CBCBCB"/>
+              <w:bottom w:val="single" w:sz="4" w:space="0" w:color="CBCBCB"/>
+              <w:right w:val="single" w:sz="4" w:space="0" w:color="CBCBCB"/>
+            </w:tcBorders>
+          </w:tcPr>
+          <w:p>
+            <w:r>
+              <w:rPr>
+                <w:sz w:val="20"/>
+              </w:rPr>
+              <w:t>---------</w:t>
+            </w:r>
+          </w:p>
+        </w:tc>
+        <w:tc>
+          <w:tcPr>
+            <w:tcW w:type="dxa" w:w="1211"/>
+            <w:tcBorders>
+              <w:top w:val="single" w:sz="4" w:space="0" w:color="CBCBCB"/>
+              <w:left w:val="single" w:sz="4" w:space="0" w:color="CBCBCB"/>
+              <w:bottom w:val="single" w:sz="4" w:space="0" w:color="CBCBCB"/>
+              <w:right w:val="single" w:sz="4" w:space="0" w:color="CBCBCB"/>
+            </w:tcBorders>
+          </w:tcPr>
+          <w:p>
+            <w:r>
+              <w:rPr>
+                <w:sz w:val="20"/>
+              </w:rPr>
+              <w:t>---------------------------------------------</w:t>
+            </w:r>
+          </w:p>
+        </w:tc>
+        <w:tc>
+          <w:tcPr>
+            <w:tcW w:type="dxa" w:w="1211"/>
+            <w:tcBorders>
+              <w:top w:val="single" w:sz="4" w:space="0" w:color="CBCBCB"/>
+              <w:left w:val="single" w:sz="4" w:space="0" w:color="CBCBCB"/>
+              <w:bottom w:val="single" w:sz="4" w:space="0" w:color="CBCBCB"/>
+              <w:right w:val="single" w:sz="4" w:space="0" w:color="CBCBCB"/>
+            </w:tcBorders>
+          </w:tcPr>
+          <w:p>
+            <w:r>
+              <w:rPr>
+                <w:sz w:val="20"/>
+              </w:rPr>
+              <w:t>--------------------------------------------------</w:t>
+            </w:r>
+          </w:p>
+        </w:tc>
+        <w:tc>
+          <w:tcPr>
+            <w:tcW w:type="dxa" w:w="1211"/>
+            <w:tcBorders>
+              <w:top w:val="single" w:sz="4" w:space="0" w:color="CBCBCB"/>
+              <w:left w:val="single" w:sz="4" w:space="0" w:color="CBCBCB"/>
+              <w:bottom w:val="single" w:sz="4" w:space="0" w:color="CBCBCB"/>
+              <w:right w:val="single" w:sz="4" w:space="0" w:color="CBCBCB"/>
+            </w:tcBorders>
+          </w:tcPr>
+          <w:p>
+            <w:r>
+              <w:rPr>
+                <w:sz w:val="20"/>
+              </w:rPr>
+              <w:t>---------------------------------------------</w:t>
+            </w:r>
+          </w:p>
+        </w:tc>
+        <w:tc>
+          <w:tcPr>
+            <w:tcW w:type="dxa" w:w="1211"/>
+            <w:tcBorders>
+              <w:top w:val="single" w:sz="4" w:space="0" w:color="CBCBCB"/>
+              <w:left w:val="single" w:sz="4" w:space="0" w:color="CBCBCB"/>
+              <w:bottom w:val="single" w:sz="4" w:space="0" w:color="CBCBCB"/>
+              <w:right w:val="single" w:sz="4" w:space="0" w:color="CBCBCB"/>
+            </w:tcBorders>
+          </w:tcPr>
+          <w:p>
+            <w:r>
+              <w:rPr>
+                <w:sz w:val="20"/>
+              </w:rPr>
+              <w:t>------------------------------</w:t>
+            </w:r>
+          </w:p>
+        </w:tc>
+        <w:tc>
+          <w:tcPr>
+            <w:tcW w:type="dxa" w:w="1211"/>
+            <w:tcBorders>
+              <w:top w:val="single" w:sz="4" w:space="0" w:color="CBCBCB"/>
+              <w:left w:val="single" w:sz="4" w:space="0" w:color="CBCBCB"/>
+              <w:bottom w:val="single" w:sz="4" w:space="0" w:color="CBCBCB"/>
+              <w:right w:val="single" w:sz="4" w:space="0" w:color="CBCBCB"/>
+            </w:tcBorders>
+          </w:tcPr>
+          <w:p>
+            <w:r>
+              <w:rPr>
+                <w:sz w:val="20"/>
+              </w:rPr>
+              <w:t>----------------------------------------------</w:t>
+            </w:r>
+          </w:p>
+        </w:tc>
+        <w:tc>
+          <w:tcPr>
+            <w:tcW w:type="dxa" w:w="1211"/>
+            <w:tcBorders>
+              <w:top w:val="single" w:sz="4" w:space="0" w:color="CBCBCB"/>
+              <w:left w:val="single" w:sz="4" w:space="0" w:color="CBCBCB"/>
+              <w:bottom w:val="single" w:sz="4" w:space="0" w:color="CBCBCB"/>
+              <w:right w:val="single" w:sz="4" w:space="0" w:color="CBCBCB"/>
+            </w:tcBorders>
+          </w:tcPr>
+          <w:p>
+            <w:r>
+              <w:rPr>
+                <w:sz w:val="20"/>
+              </w:rPr>
+              <w:t>-----------------</w:t>
+            </w:r>
+          </w:p>
+        </w:tc>
+      </w:tr>
+      <w:tr>
+        <w:tc>
+          <w:tcPr>
+            <w:tcW w:type="dxa" w:w="1211"/>
+            <w:shd w:val="clear" w:color="auto" w:fill="B8B3D6"/>
+            <w:tcBorders>
+              <w:top w:val="single" w:sz="4" w:space="0" w:color="CBCBCB"/>
+              <w:left w:val="single" w:sz="4" w:space="0" w:color="CBCBCB"/>
+              <w:bottom w:val="single" w:sz="4" w:space="0" w:color="CBCBCB"/>
+              <w:right w:val="single" w:sz="4" w:space="0" w:color="CBCBCB"/>
+            </w:tcBorders>
+          </w:tcPr>
+          <w:p>
+            <w:r>
+              <w:rPr>
+                <w:sz w:val="20"/>
+              </w:rPr>
+              <w:t>E1</w:t>
+            </w:r>
+          </w:p>
+        </w:tc>
+        <w:tc>
+          <w:tcPr>
+            <w:tcW w:type="dxa" w:w="1211"/>
+            <w:shd w:val="clear" w:color="auto" w:fill="B8B3D6"/>
+            <w:tcBorders>
+              <w:top w:val="single" w:sz="4" w:space="0" w:color="CBCBCB"/>
+              <w:left w:val="single" w:sz="4" w:space="0" w:color="CBCBCB"/>
+              <w:bottom w:val="single" w:sz="4" w:space="0" w:color="CBCBCB"/>
+              <w:right w:val="single" w:sz="4" w:space="0" w:color="CBCBCB"/>
+            </w:tcBorders>
+          </w:tcPr>
+          <w:p>
+            <w:r>
+              <w:rPr>
+                <w:b/>
+                <w:sz w:val="20"/>
+              </w:rPr>
+              <w:t>Cài skill UI UX Pro Max vào workspace Claude Code</w:t>
+            </w:r>
+          </w:p>
+        </w:tc>
+        <w:tc>
+          <w:tcPr>
+            <w:tcW w:type="dxa" w:w="1211"/>
+            <w:shd w:val="clear" w:color="auto" w:fill="B8B3D6"/>
+            <w:tcBorders>
+              <w:top w:val="single" w:sz="4" w:space="0" w:color="CBCBCB"/>
+              <w:left w:val="single" w:sz="4" w:space="0" w:color="CBCBCB"/>
+              <w:bottom w:val="single" w:sz="4" w:space="0" w:color="CBCBCB"/>
+              <w:right w:val="single" w:sz="4" w:space="0" w:color="CBCBCB"/>
+            </w:tcBorders>
+          </w:tcPr>
+          <w:p>
+            <w:r>
+              <w:rPr>
+                <w:rFonts w:ascii="Courier New" w:hAnsi="Courier New"/>
+                <w:color w:val="F05922"/>
+                <w:sz w:val="20"/>
+              </w:rPr>
+              <w:t>.claude/skills/</w:t>
+            </w:r>
+            <w:r>
+              <w:rPr>
+                <w:sz w:val="20"/>
+              </w:rPr>
+              <w:t xml:space="preserve"> chưa có bất kỳ skill nào liên quan design. Agent UI/UX Designer và các agent code (Senior Dev, Junior Dev) khi tạo UI phụ thuộc hoàn toàn vào LLM suy đoán style, màu, font — không có database tham chiếu.</w:t>
+            </w:r>
+          </w:p>
+        </w:tc>
+        <w:tc>
+          <w:tcPr>
+            <w:tcW w:type="dxa" w:w="1211"/>
+            <w:shd w:val="clear" w:color="auto" w:fill="B8B3D6"/>
+            <w:tcBorders>
+              <w:top w:val="single" w:sz="4" w:space="0" w:color="CBCBCB"/>
+              <w:left w:val="single" w:sz="4" w:space="0" w:color="CBCBCB"/>
+              <w:bottom w:val="single" w:sz="4" w:space="0" w:color="CBCBCB"/>
+              <w:right w:val="single" w:sz="4" w:space="0" w:color="CBCBCB"/>
+            </w:tcBorders>
+          </w:tcPr>
+          <w:p>
+            <w:r>
+              <w:rPr>
+                <w:rFonts w:ascii="Courier New" w:hAnsi="Courier New"/>
+                <w:color w:val="F05922"/>
+                <w:sz w:val="20"/>
+              </w:rPr>
+              <w:t>skill.json</w:t>
+            </w:r>
+            <w:r>
+              <w:rPr>
+                <w:sz w:val="20"/>
+              </w:rPr>
+              <w:t xml:space="preserve"> + CLI installer: </w:t>
+            </w:r>
+            <w:r>
+              <w:rPr>
+                <w:rFonts w:ascii="Courier New" w:hAnsi="Courier New"/>
+                <w:color w:val="F05922"/>
+                <w:sz w:val="20"/>
+              </w:rPr>
+              <w:t>npm install -g ui-ux-pro-max-cli &amp;&amp; uipro init --ai claude --global</w:t>
+            </w:r>
+            <w:r>
+              <w:rPr>
+                <w:sz w:val="20"/>
+              </w:rPr>
+              <w:t xml:space="preserve"> → sinh ra </w:t>
+            </w:r>
+            <w:r>
+              <w:rPr>
+                <w:rFonts w:ascii="Courier New" w:hAnsi="Courier New"/>
+                <w:color w:val="F05922"/>
+                <w:sz w:val="20"/>
+              </w:rPr>
+              <w:t>.claude/skills/ui-ux-pro-max/</w:t>
+            </w:r>
+            <w:r>
+              <w:rPr>
+                <w:sz w:val="20"/>
+              </w:rPr>
+              <w:t xml:space="preserve"> chứa đầy đủ </w:t>
+            </w:r>
+            <w:r>
+              <w:rPr>
+                <w:rFonts w:ascii="Courier New" w:hAnsi="Courier New"/>
+                <w:color w:val="F05922"/>
+                <w:sz w:val="20"/>
+              </w:rPr>
+              <w:t>data/</w:t>
+            </w:r>
+            <w:r>
+              <w:rPr>
+                <w:sz w:val="20"/>
+              </w:rPr>
+              <w:t xml:space="preserve">, </w:t>
+            </w:r>
+            <w:r>
+              <w:rPr>
+                <w:rFonts w:ascii="Courier New" w:hAnsi="Courier New"/>
+                <w:color w:val="F05922"/>
+                <w:sz w:val="20"/>
+              </w:rPr>
+              <w:t>scripts/</w:t>
+            </w:r>
+            <w:r>
+              <w:rPr>
+                <w:sz w:val="20"/>
+              </w:rPr>
+              <w:t xml:space="preserve">, </w:t>
+            </w:r>
+            <w:r>
+              <w:rPr>
+                <w:rFonts w:ascii="Courier New" w:hAnsi="Courier New"/>
+                <w:color w:val="F05922"/>
+                <w:sz w:val="20"/>
+              </w:rPr>
+              <w:t>SKILL.md</w:t>
+            </w:r>
+          </w:p>
+        </w:tc>
+        <w:tc>
+          <w:tcPr>
+            <w:tcW w:type="dxa" w:w="1211"/>
+            <w:shd w:val="clear" w:color="auto" w:fill="B8B3D6"/>
+            <w:tcBorders>
+              <w:top w:val="single" w:sz="4" w:space="0" w:color="CBCBCB"/>
+              <w:left w:val="single" w:sz="4" w:space="0" w:color="CBCBCB"/>
+              <w:bottom w:val="single" w:sz="4" w:space="0" w:color="CBCBCB"/>
+              <w:right w:val="single" w:sz="4" w:space="0" w:color="CBCBCB"/>
+            </w:tcBorders>
+          </w:tcPr>
+          <w:p>
+            <w:r>
+              <w:rPr>
+                <w:sz w:val="20"/>
+              </w:rPr>
+              <w:t>Khi Senior/Junior Dev viết UI Avalonia hoặc WinForms, agent không có nguồn nào để tra cứu pattern phù hợp → dễ ra output mặc định (generic, không brand). Không có searchable database = AI luôn phải đoán.</w:t>
+            </w:r>
+          </w:p>
+        </w:tc>
+        <w:tc>
+          <w:tcPr>
+            <w:tcW w:type="dxa" w:w="1211"/>
+            <w:shd w:val="clear" w:color="auto" w:fill="B8B3D6"/>
+            <w:tcBorders>
+              <w:top w:val="single" w:sz="4" w:space="0" w:color="CBCBCB"/>
+              <w:left w:val="single" w:sz="4" w:space="0" w:color="CBCBCB"/>
+              <w:bottom w:val="single" w:sz="4" w:space="0" w:color="CBCBCB"/>
+              <w:right w:val="single" w:sz="4" w:space="0" w:color="CBCBCB"/>
+            </w:tcBorders>
+          </w:tcPr>
+          <w:p>
+            <w:r>
+              <w:rPr>
+                <w:rFonts w:ascii="Courier New" w:hAnsi="Courier New"/>
+                <w:color w:val="F05922"/>
+                <w:sz w:val="20"/>
+              </w:rPr>
+              <w:t>.claude/skills/ui-ux-pro-max/</w:t>
+            </w:r>
+            <w:r>
+              <w:rPr>
+                <w:sz w:val="20"/>
+              </w:rPr>
+              <w:t xml:space="preserve"> (thư mục mới, cài bởi CLI) — sau đó thêm 1 dòng nhắc trong </w:t>
+            </w:r>
+            <w:r>
+              <w:rPr>
+                <w:rFonts w:ascii="Courier New" w:hAnsi="Courier New"/>
+                <w:color w:val="F05922"/>
+                <w:sz w:val="20"/>
+              </w:rPr>
+              <w:t>ui-ux-designer.md</w:t>
+            </w:r>
+            <w:r>
+              <w:rPr>
+                <w:sz w:val="20"/>
+              </w:rPr>
+              <w:t xml:space="preserve"> và </w:t>
+            </w:r>
+            <w:r>
+              <w:rPr>
+                <w:rFonts w:ascii="Courier New" w:hAnsi="Courier New"/>
+                <w:color w:val="F05922"/>
+                <w:sz w:val="20"/>
+              </w:rPr>
+              <w:t>senior-developer.md</w:t>
+            </w:r>
+            <w:r>
+              <w:rPr>
+                <w:sz w:val="20"/>
+              </w:rPr>
+              <w:t xml:space="preserve">: "Trước khi code UI, query </w:t>
+            </w:r>
+            <w:r>
+              <w:rPr>
+                <w:rFonts w:ascii="Courier New" w:hAnsi="Courier New"/>
+                <w:color w:val="F05922"/>
+                <w:sz w:val="20"/>
+              </w:rPr>
+              <w:t>python scripts/search.py</w:t>
+            </w:r>
+            <w:r>
+              <w:rPr>
+                <w:sz w:val="20"/>
+              </w:rPr>
+              <w:t>"</w:t>
+            </w:r>
+          </w:p>
+        </w:tc>
+        <w:tc>
+          <w:tcPr>
+            <w:tcW w:type="dxa" w:w="1211"/>
+            <w:shd w:val="clear" w:color="auto" w:fill="B8B3D6"/>
+            <w:tcBorders>
+              <w:top w:val="single" w:sz="4" w:space="0" w:color="CBCBCB"/>
+              <w:left w:val="single" w:sz="4" w:space="0" w:color="CBCBCB"/>
+              <w:bottom w:val="single" w:sz="4" w:space="0" w:color="CBCBCB"/>
+              <w:right w:val="single" w:sz="4" w:space="0" w:color="CBCBCB"/>
+            </w:tcBorders>
+          </w:tcPr>
+          <w:p>
+            <w:r>
+              <w:rPr>
+                <w:sz w:val="20"/>
+              </w:rPr>
+              <w:t xml:space="preserve">Agent có thể gọi </w:t>
+            </w:r>
+            <w:r>
+              <w:rPr>
+                <w:rFonts w:ascii="Courier New" w:hAnsi="Courier New"/>
+                <w:color w:val="F05922"/>
+                <w:sz w:val="20"/>
+              </w:rPr>
+              <w:t>python scripts/search.py "avalonia dashboard" --stack avalonia</w:t>
+            </w:r>
+            <w:r>
+              <w:rPr>
+                <w:sz w:val="20"/>
+              </w:rPr>
+              <w:t xml:space="preserve"> và nhận 3 Do/Don't guidelines cụ thể kèm code example thay vì suy đoán. Tương tự cho web UI: </w:t>
+            </w:r>
+            <w:r>
+              <w:rPr>
+                <w:rFonts w:ascii="Courier New" w:hAnsi="Courier New"/>
+                <w:color w:val="F05922"/>
+                <w:sz w:val="20"/>
+              </w:rPr>
+              <w:t>--stack react</w:t>
+            </w:r>
+            <w:r>
+              <w:rPr>
+                <w:sz w:val="20"/>
+              </w:rPr>
+              <w:t xml:space="preserve">, </w:t>
+            </w:r>
+            <w:r>
+              <w:rPr>
+                <w:rFonts w:ascii="Courier New" w:hAnsi="Courier New"/>
+                <w:color w:val="F05922"/>
+                <w:sz w:val="20"/>
+              </w:rPr>
+              <w:t>--stack html-tailwind</w:t>
+            </w:r>
+            <w:r>
+              <w:rPr>
+                <w:sz w:val="20"/>
+              </w:rPr>
+              <w:t>.</w:t>
+            </w:r>
+          </w:p>
+        </w:tc>
+        <w:tc>
+          <w:tcPr>
+            <w:tcW w:type="dxa" w:w="1211"/>
+            <w:shd w:val="clear" w:color="auto" w:fill="B8B3D6"/>
+            <w:tcBorders>
+              <w:top w:val="single" w:sz="4" w:space="0" w:color="CBCBCB"/>
+              <w:left w:val="single" w:sz="4" w:space="0" w:color="CBCBCB"/>
+              <w:bottom w:val="single" w:sz="4" w:space="0" w:color="CBCBCB"/>
+              <w:right w:val="single" w:sz="4" w:space="0" w:color="CBCBCB"/>
+            </w:tcBorders>
+          </w:tcPr>
+          <w:p>
+            <w:r>
+              <w:rPr>
+                <w:sz w:val="20"/>
+              </w:rPr>
+              <w:t>Rủi ro thấp — chỉ thêm thư mục data + scripts, không sửa code hiện có. Effort thấp: 1 lệnh CLI + cập nhật 2 file agent (3–5 dòng mỗi file). Cần Python 3.x có sẵn trên máy.</w:t>
+            </w:r>
+          </w:p>
+        </w:tc>
+      </w:tr>
+      <w:tr>
+        <w:tc>
+          <w:tcPr>
+            <w:tcW w:type="dxa" w:w="1211"/>
+            <w:tcBorders>
+              <w:top w:val="single" w:sz="4" w:space="0" w:color="CBCBCB"/>
+              <w:left w:val="single" w:sz="4" w:space="0" w:color="CBCBCB"/>
+              <w:bottom w:val="single" w:sz="4" w:space="0" w:color="CBCBCB"/>
+              <w:right w:val="single" w:sz="4" w:space="0" w:color="CBCBCB"/>
+            </w:tcBorders>
+          </w:tcPr>
+          <w:p>
+            <w:r>
+              <w:rPr>
+                <w:sz w:val="20"/>
+              </w:rPr>
+              <w:t>E2</w:t>
+            </w:r>
+          </w:p>
+        </w:tc>
+        <w:tc>
+          <w:tcPr>
+            <w:tcW w:type="dxa" w:w="1211"/>
+            <w:tcBorders>
+              <w:top w:val="single" w:sz="4" w:space="0" w:color="CBCBCB"/>
+              <w:left w:val="single" w:sz="4" w:space="0" w:color="CBCBCB"/>
+              <w:bottom w:val="single" w:sz="4" w:space="0" w:color="CBCBCB"/>
+              <w:right w:val="single" w:sz="4" w:space="0" w:color="CBCBCB"/>
+            </w:tcBorders>
+          </w:tcPr>
+          <w:p>
+            <w:r>
+              <w:rPr>
+                <w:b/>
+                <w:sz w:val="20"/>
+              </w:rPr>
+              <w:t>Tích hợp Design System Generator vào quy trình UI/UX Designer</w:t>
+            </w:r>
+          </w:p>
+        </w:tc>
+        <w:tc>
+          <w:tcPr>
+            <w:tcW w:type="dxa" w:w="1211"/>
+            <w:tcBorders>
+              <w:top w:val="single" w:sz="4" w:space="0" w:color="CBCBCB"/>
+              <w:left w:val="single" w:sz="4" w:space="0" w:color="CBCBCB"/>
+              <w:bottom w:val="single" w:sz="4" w:space="0" w:color="CBCBCB"/>
+              <w:right w:val="single" w:sz="4" w:space="0" w:color="CBCBCB"/>
+            </w:tcBorders>
+          </w:tcPr>
+          <w:p>
+            <w:r>
+              <w:rPr>
+                <w:rFonts w:ascii="Courier New" w:hAnsi="Courier New"/>
+                <w:color w:val="F05922"/>
+                <w:sz w:val="20"/>
+              </w:rPr>
+              <w:t>ui-ux-designer.md</w:t>
+            </w:r>
+            <w:r>
+              <w:rPr>
+                <w:sz w:val="20"/>
+              </w:rPr>
+              <w:t xml:space="preserve"> mô tả quy trình wireframe → mockup nhưng không chỉ định cách agent chọn style/color/typography. Kết quả: mỗi session tạo ra palette và style khác nhau, không nhất quán giữa các feature.</w:t>
+            </w:r>
+          </w:p>
+        </w:tc>
+        <w:tc>
+          <w:tcPr>
+            <w:tcW w:type="dxa" w:w="1211"/>
+            <w:tcBorders>
+              <w:top w:val="single" w:sz="4" w:space="0" w:color="CBCBCB"/>
+              <w:left w:val="single" w:sz="4" w:space="0" w:color="CBCBCB"/>
+              <w:bottom w:val="single" w:sz="4" w:space="0" w:color="CBCBCB"/>
+              <w:right w:val="single" w:sz="4" w:space="0" w:color="CBCBCB"/>
+            </w:tcBorders>
+          </w:tcPr>
+          <w:p>
+            <w:r>
+              <w:rPr>
+                <w:rFonts w:ascii="Courier New" w:hAnsi="Courier New"/>
+                <w:color w:val="F05922"/>
+                <w:sz w:val="20"/>
+              </w:rPr>
+              <w:t>src/ui-ux-pro-max/scripts/design_system.py</w:t>
+            </w:r>
+            <w:r>
+              <w:rPr>
+                <w:sz w:val="20"/>
+              </w:rPr>
+              <w:t xml:space="preserve"> + </w:t>
+            </w:r>
+            <w:r>
+              <w:rPr>
+                <w:rFonts w:ascii="Courier New" w:hAnsi="Courier New"/>
+                <w:color w:val="F05922"/>
+                <w:sz w:val="20"/>
+              </w:rPr>
+              <w:t>--persist</w:t>
+            </w:r>
+            <w:r>
+              <w:rPr>
+                <w:sz w:val="20"/>
+              </w:rPr>
+              <w:t xml:space="preserve"> flag: lệnh </w:t>
+            </w:r>
+            <w:r>
+              <w:rPr>
+                <w:rFonts w:ascii="Courier New" w:hAnsi="Courier New"/>
+                <w:color w:val="F05922"/>
+                <w:sz w:val="20"/>
+              </w:rPr>
+              <w:t>python3 scripts/search.py "&lt;project type&gt;" --design-system --persist -p "ProjectName"</w:t>
+            </w:r>
+            <w:r>
+              <w:rPr>
+                <w:sz w:val="20"/>
+              </w:rPr>
+              <w:t xml:space="preserve"> sinh </w:t>
+            </w:r>
+            <w:r>
+              <w:rPr>
+                <w:rFonts w:ascii="Courier New" w:hAnsi="Courier New"/>
+                <w:color w:val="F05922"/>
+                <w:sz w:val="20"/>
+              </w:rPr>
+              <w:t>design-system/MASTER.md</w:t>
+            </w:r>
+          </w:p>
+        </w:tc>
+        <w:tc>
+          <w:tcPr>
+            <w:tcW w:type="dxa" w:w="1211"/>
+            <w:tcBorders>
+              <w:top w:val="single" w:sz="4" w:space="0" w:color="CBCBCB"/>
+              <w:left w:val="single" w:sz="4" w:space="0" w:color="CBCBCB"/>
+              <w:bottom w:val="single" w:sz="4" w:space="0" w:color="CBCBCB"/>
+              <w:right w:val="single" w:sz="4" w:space="0" w:color="CBCBCB"/>
+            </w:tcBorders>
+          </w:tcPr>
+          <w:p>
+            <w:r>
+              <w:rPr>
+                <w:sz w:val="20"/>
+              </w:rPr>
+              <w:t>Hiện tại không có "design system document" nào được sinh ra và lưu lại cho từng dự án → AI dùng style khác nhau mỗi session. Bước thiết kế của WF-FEATURE không có output cụ thể về design token/palette đã chốt.</w:t>
+            </w:r>
+          </w:p>
+        </w:tc>
+        <w:tc>
+          <w:tcPr>
+            <w:tcW w:type="dxa" w:w="1211"/>
+            <w:tcBorders>
+              <w:top w:val="single" w:sz="4" w:space="0" w:color="CBCBCB"/>
+              <w:left w:val="single" w:sz="4" w:space="0" w:color="CBCBCB"/>
+              <w:bottom w:val="single" w:sz="4" w:space="0" w:color="CBCBCB"/>
+              <w:right w:val="single" w:sz="4" w:space="0" w:color="CBCBCB"/>
+            </w:tcBorders>
+          </w:tcPr>
+          <w:p>
+            <w:r>
+              <w:rPr>
+                <w:rFonts w:ascii="Courier New" w:hAnsi="Courier New"/>
+                <w:color w:val="F05922"/>
+                <w:sz w:val="20"/>
+              </w:rPr>
+              <w:t>ui-ux-designer.md</w:t>
+            </w:r>
+            <w:r>
+              <w:rPr>
+                <w:sz w:val="20"/>
+              </w:rPr>
+              <w:t xml:space="preserve"> → thêm bước trong Quy trình: "Bước 0: Nếu </w:t>
+            </w:r>
+            <w:r>
+              <w:rPr>
+                <w:rFonts w:ascii="Courier New" w:hAnsi="Courier New"/>
+                <w:color w:val="F05922"/>
+                <w:sz w:val="20"/>
+              </w:rPr>
+              <w:t>design-system/MASTER.md</w:t>
+            </w:r>
+            <w:r>
+              <w:rPr>
+                <w:sz w:val="20"/>
+              </w:rPr>
+              <w:t xml:space="preserve"> chưa tồn tại → chạy design system generator và lưu"; thêm artifact </w:t>
+            </w:r>
+            <w:r>
+              <w:rPr>
+                <w:rFonts w:ascii="Courier New" w:hAnsi="Courier New"/>
+                <w:color w:val="F05922"/>
+                <w:sz w:val="20"/>
+              </w:rPr>
+              <w:t>design-system/MASTER.md</w:t>
+            </w:r>
+            <w:r>
+              <w:rPr>
+                <w:sz w:val="20"/>
+              </w:rPr>
+              <w:t xml:space="preserve"> vào danh sách artifact bắt buộc của agent này.</w:t>
+            </w:r>
+          </w:p>
+        </w:tc>
+        <w:tc>
+          <w:tcPr>
+            <w:tcW w:type="dxa" w:w="1211"/>
+            <w:tcBorders>
+              <w:top w:val="single" w:sz="4" w:space="0" w:color="CBCBCB"/>
+              <w:left w:val="single" w:sz="4" w:space="0" w:color="CBCBCB"/>
+              <w:bottom w:val="single" w:sz="4" w:space="0" w:color="CBCBCB"/>
+              <w:right w:val="single" w:sz="4" w:space="0" w:color="CBCBCB"/>
+            </w:tcBorders>
+          </w:tcPr>
+          <w:p>
+            <w:r>
+              <w:rPr>
+                <w:sz w:val="20"/>
+              </w:rPr>
+              <w:t xml:space="preserve">Dự án sẽ có 1 file </w:t>
+            </w:r>
+            <w:r>
+              <w:rPr>
+                <w:rFonts w:ascii="Courier New" w:hAnsi="Courier New"/>
+                <w:color w:val="F05922"/>
+                <w:sz w:val="20"/>
+              </w:rPr>
+              <w:t>design-system/MASTER.md</w:t>
+            </w:r>
+            <w:r>
+              <w:rPr>
+                <w:sz w:val="20"/>
+              </w:rPr>
+              <w:t xml:space="preserve"> là nguồn sự thật về palette + typography + style. Agent ở mọi session sau đọc file này thay vì tự đoán → style nhất quán xuyên session và xuyên agent (Dev cũng đọc được).</w:t>
+            </w:r>
+          </w:p>
+        </w:tc>
+        <w:tc>
+          <w:tcPr>
+            <w:tcW w:type="dxa" w:w="1211"/>
+            <w:tcBorders>
+              <w:top w:val="single" w:sz="4" w:space="0" w:color="CBCBCB"/>
+              <w:left w:val="single" w:sz="4" w:space="0" w:color="CBCBCB"/>
+              <w:bottom w:val="single" w:sz="4" w:space="0" w:color="CBCBCB"/>
+              <w:right w:val="single" w:sz="4" w:space="0" w:color="CBCBCB"/>
+            </w:tcBorders>
+          </w:tcPr>
+          <w:p>
+            <w:r>
+              <w:rPr>
+                <w:sz w:val="20"/>
+              </w:rPr>
+              <w:t xml:space="preserve">Rủi ro thấp — pattern persist chỉ tạo file Markdown, không sửa code. Effort thấp-vừa: cập nhật </w:t>
+            </w:r>
+            <w:r>
+              <w:rPr>
+                <w:rFonts w:ascii="Courier New" w:hAnsi="Courier New"/>
+                <w:color w:val="F05922"/>
+                <w:sz w:val="20"/>
+              </w:rPr>
+              <w:t>ui-ux-designer.md</w:t>
+            </w:r>
+            <w:r>
+              <w:rPr>
+                <w:sz w:val="20"/>
+              </w:rPr>
+              <w:t xml:space="preserve"> (~15 dòng) + template </w:t>
+            </w:r>
+            <w:r>
+              <w:rPr>
+                <w:rFonts w:ascii="Courier New" w:hAnsi="Courier New"/>
+                <w:color w:val="F05922"/>
+                <w:sz w:val="20"/>
+              </w:rPr>
+              <w:t>design-system/</w:t>
+            </w:r>
+            <w:r>
+              <w:rPr>
+                <w:sz w:val="20"/>
+              </w:rPr>
+              <w:t xml:space="preserve"> structure. Phụ thuộc E1 (cần skill đã cài).</w:t>
+            </w:r>
+          </w:p>
+        </w:tc>
+      </w:tr>
+      <w:tr>
+        <w:tc>
+          <w:tcPr>
+            <w:tcW w:type="dxa" w:w="1211"/>
+            <w:shd w:val="clear" w:color="auto" w:fill="B8B3D6"/>
+            <w:tcBorders>
+              <w:top w:val="single" w:sz="4" w:space="0" w:color="CBCBCB"/>
+              <w:left w:val="single" w:sz="4" w:space="0" w:color="CBCBCB"/>
+              <w:bottom w:val="single" w:sz="4" w:space="0" w:color="CBCBCB"/>
+              <w:right w:val="single" w:sz="4" w:space="0" w:color="CBCBCB"/>
+            </w:tcBorders>
+          </w:tcPr>
+          <w:p>
+            <w:r>
+              <w:rPr>
+                <w:sz w:val="20"/>
+              </w:rPr>
+              <w:t>E3</w:t>
+            </w:r>
+          </w:p>
+        </w:tc>
+        <w:tc>
+          <w:tcPr>
+            <w:tcW w:type="dxa" w:w="1211"/>
+            <w:shd w:val="clear" w:color="auto" w:fill="B8B3D6"/>
+            <w:tcBorders>
+              <w:top w:val="single" w:sz="4" w:space="0" w:color="CBCBCB"/>
+              <w:left w:val="single" w:sz="4" w:space="0" w:color="CBCBCB"/>
+              <w:bottom w:val="single" w:sz="4" w:space="0" w:color="CBCBCB"/>
+              <w:right w:val="single" w:sz="4" w:space="0" w:color="CBCBCB"/>
+            </w:tcBorders>
+          </w:tcPr>
+          <w:p>
+            <w:r>
+              <w:rPr>
+                <w:b/>
+                <w:sz w:val="20"/>
+              </w:rPr>
+              <w:t>Chuẩn hoá Avalonia lessons thành CSV searchable (hoặc link sang Avalonia CSV của skill)</w:t>
+            </w:r>
+          </w:p>
+        </w:tc>
+        <w:tc>
+          <w:tcPr>
+            <w:tcW w:type="dxa" w:w="1211"/>
+            <w:shd w:val="clear" w:color="auto" w:fill="B8B3D6"/>
+            <w:tcBorders>
+              <w:top w:val="single" w:sz="4" w:space="0" w:color="CBCBCB"/>
+              <w:left w:val="single" w:sz="4" w:space="0" w:color="CBCBCB"/>
+              <w:bottom w:val="single" w:sz="4" w:space="0" w:color="CBCBCB"/>
+              <w:right w:val="single" w:sz="4" w:space="0" w:color="CBCBCB"/>
+            </w:tcBorders>
+          </w:tcPr>
+          <w:p>
+            <w:r>
+              <w:rPr>
+                <w:sz w:val="20"/>
+              </w:rPr>
+              <w:t xml:space="preserve">Lessons Avalonia hiện tại nằm tại </w:t>
+            </w:r>
+            <w:r>
+              <w:rPr>
+                <w:rFonts w:ascii="Courier New" w:hAnsi="Courier New"/>
+                <w:color w:val="F05922"/>
+                <w:sz w:val="20"/>
+              </w:rPr>
+              <w:t>C:\Users\nguye\.claude\lessons\avalonia\</w:t>
+            </w:r>
+            <w:r>
+              <w:rPr>
+                <w:sz w:val="20"/>
+              </w:rPr>
+              <w:t xml:space="preserve"> dạng Markdown prose (5 file: resource-path, datagrid, gotfocuseventargs...). Dạng prose không thể query bằng </w:t>
+            </w:r>
+            <w:r>
+              <w:rPr>
+                <w:rFonts w:ascii="Courier New" w:hAnsi="Courier New"/>
+                <w:color w:val="F05922"/>
+                <w:sz w:val="20"/>
+              </w:rPr>
+              <w:t>search.py</w:t>
+            </w:r>
+            <w:r>
+              <w:rPr>
+                <w:sz w:val="20"/>
+              </w:rPr>
+              <w:t>; agent phải đọc toàn bộ file để tìm 1 guideline cụ thể.</w:t>
+            </w:r>
+          </w:p>
+        </w:tc>
+        <w:tc>
+          <w:tcPr>
+            <w:tcW w:type="dxa" w:w="1211"/>
+            <w:shd w:val="clear" w:color="auto" w:fill="B8B3D6"/>
+            <w:tcBorders>
+              <w:top w:val="single" w:sz="4" w:space="0" w:color="CBCBCB"/>
+              <w:left w:val="single" w:sz="4" w:space="0" w:color="CBCBCB"/>
+              <w:bottom w:val="single" w:sz="4" w:space="0" w:color="CBCBCB"/>
+              <w:right w:val="single" w:sz="4" w:space="0" w:color="CBCBCB"/>
+            </w:tcBorders>
+          </w:tcPr>
+          <w:p>
+            <w:r>
+              <w:rPr>
+                <w:rFonts w:ascii="Courier New" w:hAnsi="Courier New"/>
+                <w:color w:val="F05922"/>
+                <w:sz w:val="20"/>
+              </w:rPr>
+              <w:t>src/ui-ux-pro-max/data/stacks/avalonia.csv</w:t>
+            </w:r>
+            <w:r>
+              <w:rPr>
+                <w:sz w:val="20"/>
+              </w:rPr>
+              <w:t xml:space="preserve"> — 29 rows có cấu trúc: </w:t>
+            </w:r>
+            <w:r>
+              <w:rPr>
+                <w:rFonts w:ascii="Courier New" w:hAnsi="Courier New"/>
+                <w:color w:val="F05922"/>
+                <w:sz w:val="20"/>
+              </w:rPr>
+              <w:t>No, Category, Guideline, Description, Do, Don't, Code Good, Code Bad, Severity, Docs URL</w:t>
+            </w:r>
+            <w:r>
+              <w:rPr>
+                <w:sz w:val="20"/>
+              </w:rPr>
+              <w:t>. Searchable bằng BM25.</w:t>
+            </w:r>
+          </w:p>
+        </w:tc>
+        <w:tc>
+          <w:tcPr>
+            <w:tcW w:type="dxa" w:w="1211"/>
+            <w:shd w:val="clear" w:color="auto" w:fill="B8B3D6"/>
+            <w:tcBorders>
+              <w:top w:val="single" w:sz="4" w:space="0" w:color="CBCBCB"/>
+              <w:left w:val="single" w:sz="4" w:space="0" w:color="CBCBCB"/>
+              <w:bottom w:val="single" w:sz="4" w:space="0" w:color="CBCBCB"/>
+              <w:right w:val="single" w:sz="4" w:space="0" w:color="CBCBCB"/>
+            </w:tcBorders>
+          </w:tcPr>
+          <w:p>
+            <w:r>
+              <w:rPr>
+                <w:sz w:val="20"/>
+              </w:rPr>
+              <w:t>Khi agent gặp vấn đề "DataGrid không có style" → phải đọc toàn bộ file lesson Avalonia (nhiều file) thay vì query đúng 1 guideline. Có 2 nguồn kiến thức Avalonia tách biệt (lessons KZTEK + skill CSV) dễ không đồng bộ. Một số gotcha trong GOTCHAS.md cũng overlap (VD: G004 về KzPasswordTextBox binding).</w:t>
+            </w:r>
+          </w:p>
+        </w:tc>
+        <w:tc>
+          <w:tcPr>
+            <w:tcW w:type="dxa" w:w="1211"/>
+            <w:shd w:val="clear" w:color="auto" w:fill="B8B3D6"/>
+            <w:tcBorders>
+              <w:top w:val="single" w:sz="4" w:space="0" w:color="CBCBCB"/>
+              <w:left w:val="single" w:sz="4" w:space="0" w:color="CBCBCB"/>
+              <w:bottom w:val="single" w:sz="4" w:space="0" w:color="CBCBCB"/>
+              <w:right w:val="single" w:sz="4" w:space="0" w:color="CBCBCB"/>
+            </w:tcBorders>
+          </w:tcPr>
+          <w:p>
+            <w:r>
+              <w:rPr>
+                <w:sz w:val="20"/>
+              </w:rPr>
+              <w:t xml:space="preserve">Phương án A (ưu tiên): Sau khi cài E1, thêm vào </w:t>
+            </w:r>
+            <w:r>
+              <w:rPr>
+                <w:rFonts w:ascii="Courier New" w:hAnsi="Courier New"/>
+                <w:color w:val="F05922"/>
+                <w:sz w:val="20"/>
+              </w:rPr>
+              <w:t>pre-coding-check.md</w:t>
+            </w:r>
+            <w:r>
+              <w:rPr>
+                <w:sz w:val="20"/>
+              </w:rPr>
+              <w:t xml:space="preserve"> bước: "Nếu task liên quan Avalonia, chạy </w:t>
+            </w:r>
+            <w:r>
+              <w:rPr>
+                <w:rFonts w:ascii="Courier New" w:hAnsi="Courier New"/>
+                <w:color w:val="F05922"/>
+                <w:sz w:val="20"/>
+              </w:rPr>
+              <w:t>python scripts/search.py '&lt;query&gt;' --stack avalonia</w:t>
+            </w:r>
+            <w:r>
+              <w:rPr>
+                <w:sz w:val="20"/>
+              </w:rPr>
+              <w:t xml:space="preserve"> trước khi đọc lesson." Phương án B (nếu muốn mở rộng): Tạo </w:t>
+            </w:r>
+            <w:r>
+              <w:rPr>
+                <w:rFonts w:ascii="Courier New" w:hAnsi="Courier New"/>
+                <w:color w:val="F05922"/>
+                <w:sz w:val="20"/>
+              </w:rPr>
+              <w:t>C:\Users\nguye\.claude\lessons\avalonia\avalonia-guidelines.csv</w:t>
+            </w:r>
+            <w:r>
+              <w:rPr>
+                <w:sz w:val="20"/>
+              </w:rPr>
+              <w:t xml:space="preserve"> copy từ </w:t>
+            </w:r>
+            <w:r>
+              <w:rPr>
+                <w:rFonts w:ascii="Courier New" w:hAnsi="Courier New"/>
+                <w:color w:val="F05922"/>
+                <w:sz w:val="20"/>
+              </w:rPr>
+              <w:t>avalonia.csv</w:t>
+            </w:r>
+            <w:r>
+              <w:rPr>
+                <w:sz w:val="20"/>
+              </w:rPr>
+              <w:t xml:space="preserve"> của skill, thêm các KZTEK-specific rows (G004, KzPasswordTextBox...).</w:t>
+            </w:r>
+          </w:p>
+        </w:tc>
+        <w:tc>
+          <w:tcPr>
+            <w:tcW w:type="dxa" w:w="1211"/>
+            <w:shd w:val="clear" w:color="auto" w:fill="B8B3D6"/>
+            <w:tcBorders>
+              <w:top w:val="single" w:sz="4" w:space="0" w:color="CBCBCB"/>
+              <w:left w:val="single" w:sz="4" w:space="0" w:color="CBCBCB"/>
+              <w:bottom w:val="single" w:sz="4" w:space="0" w:color="CBCBCB"/>
+              <w:right w:val="single" w:sz="4" w:space="0" w:color="CBCBCB"/>
+            </w:tcBorders>
+          </w:tcPr>
+          <w:p>
+            <w:r>
+              <w:rPr>
+                <w:sz w:val="20"/>
+              </w:rPr>
+              <w:t>Agent tìm guideline Avalonia trong 1 tool call (</w:t>
+            </w:r>
+            <w:r>
+              <w:rPr>
+                <w:rFonts w:ascii="Courier New" w:hAnsi="Courier New"/>
+                <w:color w:val="F05922"/>
+                <w:sz w:val="20"/>
+              </w:rPr>
+              <w:t>search.py</w:t>
+            </w:r>
+            <w:r>
+              <w:rPr>
+                <w:sz w:val="20"/>
+              </w:rPr>
+              <w:t>) thay vì 2–3 tool calls đọc file. Số lần đọc lesson trước khi code giảm từ "đọc N file để tìm M guideline" xuống "query 1 câu, nhận top-3 kết quả". Skill CSV cũng có link docs chính thức Avalonia đi kèm mỗi guideline.</w:t>
+            </w:r>
+          </w:p>
+        </w:tc>
+        <w:tc>
+          <w:tcPr>
+            <w:tcW w:type="dxa" w:w="1211"/>
+            <w:shd w:val="clear" w:color="auto" w:fill="B8B3D6"/>
+            <w:tcBorders>
+              <w:top w:val="single" w:sz="4" w:space="0" w:color="CBCBCB"/>
+              <w:left w:val="single" w:sz="4" w:space="0" w:color="CBCBCB"/>
+              <w:bottom w:val="single" w:sz="4" w:space="0" w:color="CBCBCB"/>
+              <w:right w:val="single" w:sz="4" w:space="0" w:color="CBCBCB"/>
+            </w:tcBorders>
+          </w:tcPr>
+          <w:p>
+            <w:r>
+              <w:rPr>
+                <w:sz w:val="20"/>
+              </w:rPr>
+              <w:t xml:space="preserve">Rủi ro thấp. Phương án A: effort rất thấp (3–5 dòng trong </w:t>
+            </w:r>
+            <w:r>
+              <w:rPr>
+                <w:rFonts w:ascii="Courier New" w:hAnsi="Courier New"/>
+                <w:color w:val="F05922"/>
+                <w:sz w:val="20"/>
+              </w:rPr>
+              <w:t>pre-coding-check.md</w:t>
+            </w:r>
+            <w:r>
+              <w:rPr>
+                <w:sz w:val="20"/>
+              </w:rPr>
+              <w:t>), phụ thuộc E1. Phương án B: effort vừa (tạo 1 CSV, đồng bộ với lessons hiện có); cần review để không mâu thuẫn với GOTCHAS.md.</w:t>
+            </w:r>
+          </w:p>
+        </w:tc>
+      </w:tr>
+      <w:tr>
+        <w:tc>
+          <w:tcPr>
+            <w:tcW w:type="dxa" w:w="1211"/>
+            <w:tcBorders>
+              <w:top w:val="single" w:sz="4" w:space="0" w:color="CBCBCB"/>
+              <w:left w:val="single" w:sz="4" w:space="0" w:color="CBCBCB"/>
+              <w:bottom w:val="single" w:sz="4" w:space="0" w:color="CBCBCB"/>
+              <w:right w:val="single" w:sz="4" w:space="0" w:color="CBCBCB"/>
+            </w:tcBorders>
+          </w:tcPr>
+          <w:p>
+            <w:r>
+              <w:rPr>
+                <w:sz w:val="20"/>
+              </w:rPr>
+              <w:t>E4</w:t>
+            </w:r>
+          </w:p>
+        </w:tc>
+        <w:tc>
+          <w:tcPr>
+            <w:tcW w:type="dxa" w:w="1211"/>
+            <w:tcBorders>
+              <w:top w:val="single" w:sz="4" w:space="0" w:color="CBCBCB"/>
+              <w:left w:val="single" w:sz="4" w:space="0" w:color="CBCBCB"/>
+              <w:bottom w:val="single" w:sz="4" w:space="0" w:color="CBCBCB"/>
+              <w:right w:val="single" w:sz="4" w:space="0" w:color="CBCBCB"/>
+            </w:tcBorders>
+          </w:tcPr>
+          <w:p>
+            <w:r>
+              <w:rPr>
+                <w:b/>
+                <w:sz w:val="20"/>
+              </w:rPr>
+              <w:t>Bổ sung KZTEK brand palette vào design-system MASTER template</w:t>
+            </w:r>
+          </w:p>
+        </w:tc>
+        <w:tc>
+          <w:tcPr>
+            <w:tcW w:type="dxa" w:w="1211"/>
+            <w:tcBorders>
+              <w:top w:val="single" w:sz="4" w:space="0" w:color="CBCBCB"/>
+              <w:left w:val="single" w:sz="4" w:space="0" w:color="CBCBCB"/>
+              <w:bottom w:val="single" w:sz="4" w:space="0" w:color="CBCBCB"/>
+              <w:right w:val="single" w:sz="4" w:space="0" w:color="CBCBCB"/>
+            </w:tcBorders>
+          </w:tcPr>
+          <w:p>
+            <w:r>
+              <w:rPr>
+                <w:rFonts w:ascii="Courier New" w:hAnsi="Courier New"/>
+                <w:color w:val="F05922"/>
+                <w:sz w:val="20"/>
+              </w:rPr>
+              <w:t>kztek-brand-info.md</w:t>
+            </w:r>
+            <w:r>
+              <w:rPr>
+                <w:sz w:val="20"/>
+              </w:rPr>
+              <w:t xml:space="preserve"> có màu brand (#251C53, #F05922, #4A3F8C...) và quy tắc áp dụng theo loại tài liệu (Slide/Word/Excel). Tuy nhiên không có file template </w:t>
+            </w:r>
+            <w:r>
+              <w:rPr>
+                <w:rFonts w:ascii="Courier New" w:hAnsi="Courier New"/>
+                <w:color w:val="F05922"/>
+                <w:sz w:val="20"/>
+              </w:rPr>
+              <w:t>design-system/MASTER.md</w:t>
+            </w:r>
+            <w:r>
+              <w:rPr>
+                <w:sz w:val="20"/>
+              </w:rPr>
+              <w:t xml:space="preserve"> nào chứa brand tokens ở dạng design system — mỗi khi agent cần màu KZTEK phải đọc </w:t>
+            </w:r>
+            <w:r>
+              <w:rPr>
+                <w:rFonts w:ascii="Courier New" w:hAnsi="Courier New"/>
+                <w:color w:val="F05922"/>
+                <w:sz w:val="20"/>
+              </w:rPr>
+              <w:t>kztek-brand-info.md</w:t>
+            </w:r>
+            <w:r>
+              <w:rPr>
+                <w:sz w:val="20"/>
+              </w:rPr>
+              <w:t xml:space="preserve"> và tự suy ra token.</w:t>
+            </w:r>
+          </w:p>
+        </w:tc>
+        <w:tc>
+          <w:tcPr>
+            <w:tcW w:type="dxa" w:w="1211"/>
+            <w:tcBorders>
+              <w:top w:val="single" w:sz="4" w:space="0" w:color="CBCBCB"/>
+              <w:left w:val="single" w:sz="4" w:space="0" w:color="CBCBCB"/>
+              <w:bottom w:val="single" w:sz="4" w:space="0" w:color="CBCBCB"/>
+              <w:right w:val="single" w:sz="4" w:space="0" w:color="CBCBCB"/>
+            </w:tcBorders>
+          </w:tcPr>
+          <w:p>
+            <w:r>
+              <w:rPr>
+                <w:rFonts w:ascii="Courier New" w:hAnsi="Courier New"/>
+                <w:color w:val="F05922"/>
+                <w:sz w:val="20"/>
+              </w:rPr>
+              <w:t>--persist</w:t>
+            </w:r>
+            <w:r>
+              <w:rPr>
+                <w:sz w:val="20"/>
+              </w:rPr>
+              <w:t xml:space="preserve"> pattern của </w:t>
+            </w:r>
+            <w:r>
+              <w:rPr>
+                <w:rFonts w:ascii="Courier New" w:hAnsi="Courier New"/>
+                <w:color w:val="F05922"/>
+                <w:sz w:val="20"/>
+              </w:rPr>
+              <w:t>design_system.py</w:t>
+            </w:r>
+            <w:r>
+              <w:rPr>
+                <w:sz w:val="20"/>
+              </w:rPr>
+              <w:t xml:space="preserve">: file </w:t>
+            </w:r>
+            <w:r>
+              <w:rPr>
+                <w:rFonts w:ascii="Courier New" w:hAnsi="Courier New"/>
+                <w:color w:val="F05922"/>
+                <w:sz w:val="20"/>
+              </w:rPr>
+              <w:t>design-system/MASTER.md</w:t>
+            </w:r>
+            <w:r>
+              <w:rPr>
+                <w:sz w:val="20"/>
+              </w:rPr>
+              <w:t xml:space="preserve"> là "Global Source of Truth" với cấu trúc: Colors, Typography, Spacing, Effects, Anti-patterns. Pattern này có thể dùng như template cho workspace KZTEK.</w:t>
+            </w:r>
+          </w:p>
+        </w:tc>
+        <w:tc>
+          <w:tcPr>
+            <w:tcW w:type="dxa" w:w="1211"/>
+            <w:tcBorders>
+              <w:top w:val="single" w:sz="4" w:space="0" w:color="CBCBCB"/>
+              <w:left w:val="single" w:sz="4" w:space="0" w:color="CBCBCB"/>
+              <w:bottom w:val="single" w:sz="4" w:space="0" w:color="CBCBCB"/>
+              <w:right w:val="single" w:sz="4" w:space="0" w:color="CBCBCB"/>
+            </w:tcBorders>
+          </w:tcPr>
+          <w:p>
+            <w:r>
+              <w:rPr>
+                <w:sz w:val="20"/>
+              </w:rPr>
+              <w:t xml:space="preserve">Agent viết UI tài liệu/slide/web KZTEK phải đọc </w:t>
+            </w:r>
+            <w:r>
+              <w:rPr>
+                <w:rFonts w:ascii="Courier New" w:hAnsi="Courier New"/>
+                <w:color w:val="F05922"/>
+                <w:sz w:val="20"/>
+              </w:rPr>
+              <w:t>kztek-brand-info.md</w:t>
+            </w:r>
+            <w:r>
+              <w:rPr>
+                <w:sz w:val="20"/>
+              </w:rPr>
+              <w:t xml:space="preserve"> rồi tự áp dụng quy tắc, dễ bỏ sót (VD: quên dùng Navy #251C53 cho heading, tự chọn màu khác). Không có file tập trung nào map "loại tài liệu → token cụ thể cần dùng" theo format design system.</w:t>
+            </w:r>
+          </w:p>
+        </w:tc>
+        <w:tc>
+          <w:tcPr>
+            <w:tcW w:type="dxa" w:w="1211"/>
+            <w:tcBorders>
+              <w:top w:val="single" w:sz="4" w:space="0" w:color="CBCBCB"/>
+              <w:left w:val="single" w:sz="4" w:space="0" w:color="CBCBCB"/>
+              <w:bottom w:val="single" w:sz="4" w:space="0" w:color="CBCBCB"/>
+              <w:right w:val="single" w:sz="4" w:space="0" w:color="CBCBCB"/>
+            </w:tcBorders>
+          </w:tcPr>
+          <w:p>
+            <w:r>
+              <w:rPr>
+                <w:sz w:val="20"/>
+              </w:rPr>
+              <w:t xml:space="preserve">Tạo file mới: </w:t>
+            </w:r>
+            <w:r>
+              <w:rPr>
+                <w:rFonts w:ascii="Courier New" w:hAnsi="Courier New"/>
+                <w:color w:val="F05922"/>
+                <w:sz w:val="20"/>
+              </w:rPr>
+              <w:t>docs/design/kztek-design-system/MASTER.md</w:t>
+            </w:r>
+            <w:r>
+              <w:rPr>
+                <w:sz w:val="20"/>
+              </w:rPr>
+              <w:t xml:space="preserve"> theo cấu trúc của </w:t>
+            </w:r>
+            <w:r>
+              <w:rPr>
+                <w:rFonts w:ascii="Courier New" w:hAnsi="Courier New"/>
+                <w:color w:val="F05922"/>
+                <w:sz w:val="20"/>
+              </w:rPr>
+              <w:t>design-system/MASTER.md</w:t>
+            </w:r>
+            <w:r>
+              <w:rPr>
+                <w:sz w:val="20"/>
+              </w:rPr>
+              <w:t xml:space="preserve"> của skill, điền brand colors KZTEK, typography, spacing conventions, anti-patterns (không dùng đỏ tươi, không mix palette...). Cập nhật </w:t>
+            </w:r>
+            <w:r>
+              <w:rPr>
+                <w:rFonts w:ascii="Courier New" w:hAnsi="Courier New"/>
+                <w:color w:val="F05922"/>
+                <w:sz w:val="20"/>
+              </w:rPr>
+              <w:t>ui-ux-designer.md</w:t>
+            </w:r>
+            <w:r>
+              <w:rPr>
+                <w:sz w:val="20"/>
+              </w:rPr>
+              <w:t xml:space="preserve"> để reference file này.</w:t>
+            </w:r>
+          </w:p>
+        </w:tc>
+        <w:tc>
+          <w:tcPr>
+            <w:tcW w:type="dxa" w:w="1211"/>
+            <w:tcBorders>
+              <w:top w:val="single" w:sz="4" w:space="0" w:color="CBCBCB"/>
+              <w:left w:val="single" w:sz="4" w:space="0" w:color="CBCBCB"/>
+              <w:bottom w:val="single" w:sz="4" w:space="0" w:color="CBCBCB"/>
+              <w:right w:val="single" w:sz="4" w:space="0" w:color="CBCBCB"/>
+            </w:tcBorders>
+          </w:tcPr>
+          <w:p>
+            <w:r>
+              <w:rPr>
+                <w:sz w:val="20"/>
+              </w:rPr>
+              <w:t xml:space="preserve">Khi agent (Documentation Writer, UI/UX Designer, Senior Dev viết UI KZTEK) cần màu/font → đọc 1 file duy nhất </w:t>
+            </w:r>
+            <w:r>
+              <w:rPr>
+                <w:rFonts w:ascii="Courier New" w:hAnsi="Courier New"/>
+                <w:color w:val="F05922"/>
+                <w:sz w:val="20"/>
+              </w:rPr>
+              <w:t>docs/design/kztek-design-system/MASTER.md</w:t>
+            </w:r>
+            <w:r>
+              <w:rPr>
+                <w:sz w:val="20"/>
+              </w:rPr>
+              <w:t xml:space="preserve"> thay vì 2 bước (đọc </w:t>
+            </w:r>
+            <w:r>
+              <w:rPr>
+                <w:rFonts w:ascii="Courier New" w:hAnsi="Courier New"/>
+                <w:color w:val="F05922"/>
+                <w:sz w:val="20"/>
+              </w:rPr>
+              <w:t>kztek-brand-info.md</w:t>
+            </w:r>
+            <w:r>
+              <w:rPr>
+                <w:sz w:val="20"/>
+              </w:rPr>
+              <w:t xml:space="preserve"> + tự suy). File này cũng là input để generate page-specific overrides khi KZTEK có nhiều loại document cần cấu hình riêng.</w:t>
+            </w:r>
+          </w:p>
+        </w:tc>
+        <w:tc>
+          <w:tcPr>
+            <w:tcW w:type="dxa" w:w="1211"/>
+            <w:tcBorders>
+              <w:top w:val="single" w:sz="4" w:space="0" w:color="CBCBCB"/>
+              <w:left w:val="single" w:sz="4" w:space="0" w:color="CBCBCB"/>
+              <w:bottom w:val="single" w:sz="4" w:space="0" w:color="CBCBCB"/>
+              <w:right w:val="single" w:sz="4" w:space="0" w:color="CBCBCB"/>
+            </w:tcBorders>
+          </w:tcPr>
+          <w:p>
+            <w:r>
+              <w:rPr>
+                <w:sz w:val="20"/>
+              </w:rPr>
+              <w:t xml:space="preserve">Rủi ro thấp — chỉ tạo file Markdown tổng hợp, không thay thế </w:t>
+            </w:r>
+            <w:r>
+              <w:rPr>
+                <w:rFonts w:ascii="Courier New" w:hAnsi="Courier New"/>
+                <w:color w:val="F05922"/>
+                <w:sz w:val="20"/>
+              </w:rPr>
+              <w:t>kztek-brand-info.md</w:t>
+            </w:r>
+            <w:r>
+              <w:rPr>
+                <w:sz w:val="20"/>
+              </w:rPr>
+              <w:t xml:space="preserve">. Effort thấp: 1–2 giờ tạo MASTER.md từ template + nội dung </w:t>
+            </w:r>
+            <w:r>
+              <w:rPr>
+                <w:rFonts w:ascii="Courier New" w:hAnsi="Courier New"/>
+                <w:color w:val="F05922"/>
+                <w:sz w:val="20"/>
+              </w:rPr>
+              <w:t>kztek-brand-info.md</w:t>
+            </w:r>
+            <w:r>
+              <w:rPr>
+                <w:sz w:val="20"/>
+              </w:rPr>
+              <w:t>. Không phụ thuộc E1/E2.</w:t>
+            </w:r>
+          </w:p>
+        </w:tc>
+      </w:tr>
+      <w:tr>
+        <w:tc>
+          <w:tcPr>
+            <w:tcW w:type="dxa" w:w="1211"/>
+            <w:shd w:val="clear" w:color="auto" w:fill="B8B3D6"/>
+            <w:tcBorders>
+              <w:top w:val="single" w:sz="4" w:space="0" w:color="CBCBCB"/>
+              <w:left w:val="single" w:sz="4" w:space="0" w:color="CBCBCB"/>
+              <w:bottom w:val="single" w:sz="4" w:space="0" w:color="CBCBCB"/>
+              <w:right w:val="single" w:sz="4" w:space="0" w:color="CBCBCB"/>
+            </w:tcBorders>
+          </w:tcPr>
+          <w:p>
+            <w:r>
+              <w:rPr>
+                <w:sz w:val="20"/>
+              </w:rPr>
+              <w:t>E5</w:t>
+            </w:r>
+          </w:p>
+        </w:tc>
+        <w:tc>
+          <w:tcPr>
+            <w:tcW w:type="dxa" w:w="1211"/>
+            <w:shd w:val="clear" w:color="auto" w:fill="B8B3D6"/>
+            <w:tcBorders>
+              <w:top w:val="single" w:sz="4" w:space="0" w:color="CBCBCB"/>
+              <w:left w:val="single" w:sz="4" w:space="0" w:color="CBCBCB"/>
+              <w:bottom w:val="single" w:sz="4" w:space="0" w:color="CBCBCB"/>
+              <w:right w:val="single" w:sz="4" w:space="0" w:color="CBCBCB"/>
+            </w:tcBorders>
+          </w:tcPr>
+          <w:p>
+            <w:r>
+              <w:rPr>
+                <w:b/>
+                <w:sz w:val="20"/>
+              </w:rPr>
+              <w:t>Thêm hướng dẫn query design database vào `design-taste-frontend.md`</w:t>
+            </w:r>
+          </w:p>
+        </w:tc>
+        <w:tc>
+          <w:tcPr>
+            <w:tcW w:type="dxa" w:w="1211"/>
+            <w:shd w:val="clear" w:color="auto" w:fill="B8B3D6"/>
+            <w:tcBorders>
+              <w:top w:val="single" w:sz="4" w:space="0" w:color="CBCBCB"/>
+              <w:left w:val="single" w:sz="4" w:space="0" w:color="CBCBCB"/>
+              <w:bottom w:val="single" w:sz="4" w:space="0" w:color="CBCBCB"/>
+              <w:right w:val="single" w:sz="4" w:space="0" w:color="CBCBCB"/>
+            </w:tcBorders>
+          </w:tcPr>
+          <w:p>
+            <w:r>
+              <w:rPr>
+                <w:rFonts w:ascii="Courier New" w:hAnsi="Courier New"/>
+                <w:color w:val="F05922"/>
+                <w:sz w:val="20"/>
+              </w:rPr>
+              <w:t>design-taste-frontend.md</w:t>
+            </w:r>
+            <w:r>
+              <w:rPr>
+                <w:sz w:val="20"/>
+              </w:rPr>
+              <w:t xml:space="preserve"> là skill anti-slop rất phong phú (1207 dòng) cho web landing page/portfolio. Nó có 3 dials (DESIGN_VARIANCE, MOTION_INTENSITY, VISUAL_DENSITY) trùng concept với dials của ui-ux-pro-max. Tuy nhiên khi agent cần typography hoặc color palette cụ thể, nó phụ thuộc hoàn toàn vào rules hardcoded trong file — không có cơ chế query database để tìm lựa chọn phù hợp hơn với từng loại project.</w:t>
+            </w:r>
+          </w:p>
+        </w:tc>
+        <w:tc>
+          <w:tcPr>
+            <w:tcW w:type="dxa" w:w="1211"/>
+            <w:shd w:val="clear" w:color="auto" w:fill="B8B3D6"/>
+            <w:tcBorders>
+              <w:top w:val="single" w:sz="4" w:space="0" w:color="CBCBCB"/>
+              <w:left w:val="single" w:sz="4" w:space="0" w:color="CBCBCB"/>
+              <w:bottom w:val="single" w:sz="4" w:space="0" w:color="CBCBCB"/>
+              <w:right w:val="single" w:sz="4" w:space="0" w:color="CBCBCB"/>
+            </w:tcBorders>
+          </w:tcPr>
+          <w:p>
+            <w:r>
+              <w:rPr>
+                <w:rFonts w:ascii="Courier New" w:hAnsi="Courier New"/>
+                <w:color w:val="F05922"/>
+                <w:sz w:val="20"/>
+              </w:rPr>
+              <w:t>src/ui-ux-pro-max/scripts/search.py</w:t>
+            </w:r>
+            <w:r>
+              <w:rPr>
+                <w:sz w:val="20"/>
+              </w:rPr>
+              <w:t xml:space="preserve"> domain </w:t>
+            </w:r>
+            <w:r>
+              <w:rPr>
+                <w:rFonts w:ascii="Courier New" w:hAnsi="Courier New"/>
+                <w:color w:val="F05922"/>
+                <w:sz w:val="20"/>
+              </w:rPr>
+              <w:t>color</w:t>
+            </w:r>
+            <w:r>
+              <w:rPr>
+                <w:sz w:val="20"/>
+              </w:rPr>
+              <w:t xml:space="preserve">, </w:t>
+            </w:r>
+            <w:r>
+              <w:rPr>
+                <w:rFonts w:ascii="Courier New" w:hAnsi="Courier New"/>
+                <w:color w:val="F05922"/>
+                <w:sz w:val="20"/>
+              </w:rPr>
+              <w:t>typography</w:t>
+            </w:r>
+            <w:r>
+              <w:rPr>
+                <w:sz w:val="20"/>
+              </w:rPr>
+              <w:t xml:space="preserve">, </w:t>
+            </w:r>
+            <w:r>
+              <w:rPr>
+                <w:rFonts w:ascii="Courier New" w:hAnsi="Courier New"/>
+                <w:color w:val="F05922"/>
+                <w:sz w:val="20"/>
+              </w:rPr>
+              <w:t>product</w:t>
+            </w:r>
+            <w:r>
+              <w:rPr>
+                <w:sz w:val="20"/>
+              </w:rPr>
+              <w:t xml:space="preserve">: query bằng keyword → nhận top-3 palette/font phù hợp nhất thay vì dùng list cố định. Ví dụ: </w:t>
+            </w:r>
+            <w:r>
+              <w:rPr>
+                <w:rFonts w:ascii="Courier New" w:hAnsi="Courier New"/>
+                <w:color w:val="F05922"/>
+                <w:sz w:val="20"/>
+              </w:rPr>
+              <w:t>python3 scripts/search.py "saas dashboard" --domain color</w:t>
+            </w:r>
+            <w:r>
+              <w:rPr>
+                <w:sz w:val="20"/>
+              </w:rPr>
+              <w:t xml:space="preserve"> → palette phù hợp SaaS.</w:t>
+            </w:r>
+          </w:p>
+        </w:tc>
+        <w:tc>
+          <w:tcPr>
+            <w:tcW w:type="dxa" w:w="1211"/>
+            <w:shd w:val="clear" w:color="auto" w:fill="B8B3D6"/>
+            <w:tcBorders>
+              <w:top w:val="single" w:sz="4" w:space="0" w:color="CBCBCB"/>
+              <w:left w:val="single" w:sz="4" w:space="0" w:color="CBCBCB"/>
+              <w:bottom w:val="single" w:sz="4" w:space="0" w:color="CBCBCB"/>
+              <w:right w:val="single" w:sz="4" w:space="0" w:color="CBCBCB"/>
+            </w:tcBorders>
+          </w:tcPr>
+          <w:p>
+            <w:r>
+              <w:rPr>
+                <w:rFonts w:ascii="Courier New" w:hAnsi="Courier New"/>
+                <w:color w:val="F05922"/>
+                <w:sz w:val="20"/>
+              </w:rPr>
+              <w:t>design-taste-frontend.md</w:t>
+            </w:r>
+            <w:r>
+              <w:rPr>
+                <w:sz w:val="20"/>
+              </w:rPr>
+              <w:t xml:space="preserve"> Section 4.1 liệt kê font suggestions và Section 4.2 liệt kê color rules nhưng là danh sách tĩnh không thay đổi theo loại project. Khi làm SaaS vs wellness vs fintech, agent vẫn lấy cùng một pool font/color. Thiếu khả năng "tìm palette phù hợp ngành X" theo dữ liệu có cấu trúc.</w:t>
+            </w:r>
+          </w:p>
+        </w:tc>
+        <w:tc>
+          <w:tcPr>
+            <w:tcW w:type="dxa" w:w="1211"/>
+            <w:shd w:val="clear" w:color="auto" w:fill="B8B3D6"/>
+            <w:tcBorders>
+              <w:top w:val="single" w:sz="4" w:space="0" w:color="CBCBCB"/>
+              <w:left w:val="single" w:sz="4" w:space="0" w:color="CBCBCB"/>
+              <w:bottom w:val="single" w:sz="4" w:space="0" w:color="CBCBCB"/>
+              <w:right w:val="single" w:sz="4" w:space="0" w:color="CBCBCB"/>
+            </w:tcBorders>
+          </w:tcPr>
+          <w:p>
+            <w:r>
+              <w:rPr>
+                <w:rFonts w:ascii="Courier New" w:hAnsi="Courier New"/>
+                <w:color w:val="F05922"/>
+                <w:sz w:val="20"/>
+              </w:rPr>
+              <w:t>design-taste-frontend.md</w:t>
+            </w:r>
+            <w:r>
+              <w:rPr>
+                <w:sz w:val="20"/>
+              </w:rPr>
+              <w:t xml:space="preserve"> → thêm vào Section 2 (Brief → Design System Map) một bước: "Nếu đã cài ui-ux-pro-max skill (</w:t>
+            </w:r>
+            <w:r>
+              <w:rPr>
+                <w:rFonts w:ascii="Courier New" w:hAnsi="Courier New"/>
+                <w:color w:val="F05922"/>
+                <w:sz w:val="20"/>
+              </w:rPr>
+              <w:t>.claude/skills/ui-ux-pro-max/</w:t>
+            </w:r>
+            <w:r>
+              <w:rPr>
+                <w:sz w:val="20"/>
+              </w:rPr>
+              <w:t xml:space="preserve">), chạy </w:t>
+            </w:r>
+            <w:r>
+              <w:rPr>
+                <w:rFonts w:ascii="Courier New" w:hAnsi="Courier New"/>
+                <w:color w:val="F05922"/>
+                <w:sz w:val="20"/>
+              </w:rPr>
+              <w:t>python3 scripts/search.py '&lt;product type&gt;' --design-system</w:t>
+            </w:r>
+            <w:r>
+              <w:rPr>
+                <w:sz w:val="20"/>
+              </w:rPr>
+              <w:t xml:space="preserve"> để lấy palette/typography được recommend cho loại project này, sau đó áp dụng qua dials Section 1."</w:t>
+            </w:r>
+          </w:p>
+        </w:tc>
+        <w:tc>
+          <w:tcPr>
+            <w:tcW w:type="dxa" w:w="1211"/>
+            <w:shd w:val="clear" w:color="auto" w:fill="B8B3D6"/>
+            <w:tcBorders>
+              <w:top w:val="single" w:sz="4" w:space="0" w:color="CBCBCB"/>
+              <w:left w:val="single" w:sz="4" w:space="0" w:color="CBCBCB"/>
+              <w:bottom w:val="single" w:sz="4" w:space="0" w:color="CBCBCB"/>
+              <w:right w:val="single" w:sz="4" w:space="0" w:color="CBCBCB"/>
+            </w:tcBorders>
+          </w:tcPr>
+          <w:p>
+            <w:r>
+              <w:rPr>
+                <w:sz w:val="20"/>
+              </w:rPr>
+              <w:t>Khi làm landing page cho "beauty spa", agent nhận palette cụ thể có AVOID list ("Bright neon colors") từ data thay vì chỉ áp The Lila Rule generic. Kết quả: typography và palette phù hợp ngành hơn, ít "AI default". Dials của 2 tool đồng bộ concept (variance/motion/density) nên không xung đột.</w:t>
+            </w:r>
+          </w:p>
+        </w:tc>
+        <w:tc>
+          <w:tcPr>
+            <w:tcW w:type="dxa" w:w="1211"/>
+            <w:shd w:val="clear" w:color="auto" w:fill="B8B3D6"/>
+            <w:tcBorders>
+              <w:top w:val="single" w:sz="4" w:space="0" w:color="CBCBCB"/>
+              <w:left w:val="single" w:sz="4" w:space="0" w:color="CBCBCB"/>
+              <w:bottom w:val="single" w:sz="4" w:space="0" w:color="CBCBCB"/>
+              <w:right w:val="single" w:sz="4" w:space="0" w:color="CBCBCB"/>
+            </w:tcBorders>
+          </w:tcPr>
+          <w:p>
+            <w:r>
+              <w:rPr>
+                <w:sz w:val="20"/>
+              </w:rPr>
+              <w:t>Rủi ro rất thấp — chỉ thêm 1 bước optional vào skill đã có (không bắt buộc nếu skill chưa cài). Effort rất thấp: ~5–10 dòng thêm vào Section 2. Phụ thuộc E1.</w:t>
+            </w:r>
+          </w:p>
+        </w:tc>
+      </w:tr>
+    </w:tbl>
+    <w:p/>
+    <w:p>
+      <w:pPr>
+        <w:pBdr>
+          <w:bottom w:val="single" w:sz="6" w:space="1" w:color="F05922"/>
+        </w:pBdr>
+        <w:spacing w:after="120"/>
+      </w:pPr>
+    </w:p>
+    <w:p>
+      <w:pPr>
+        <w:pStyle w:val="Heading3"/>
+        <w:spacing w:before="160" w:after="60"/>
+      </w:pPr>
+      <w:r>
+        <w:rPr>
+          <w:color w:val="4A3F8C"/>
+          <w:sz w:val="24"/>
+        </w:rPr>
+        <w:t>Tóm tắt đề xuất và dependency</w:t>
+      </w:r>
+    </w:p>
+    <w:p>
+      <w:pPr>
+        <w:spacing w:before="80" w:after="80"/>
+        <w:ind w:left="283"/>
+        <w:shd w:val="clear" w:color="auto" w:fill="F4F4F8"/>
+      </w:pPr>
+      <w:r>
+        <w:rPr>
+          <w:rFonts w:ascii="Courier New" w:hAnsi="Courier New"/>
+          <w:color w:val="251C53"/>
+          <w:sz w:val="18"/>
+        </w:rPr>
+        <w:t>E4 (standalone, không phụ thuộc) — tạo KZTEK design system MASTER.md</w:t>
+        <w:br/>
+        <w:t>E1 (cài skill) → E2 (design system generator) + E3 Phương án A + E5</w:t>
+        <w:br/>
+        <w:t>E3 Phương án B (standalone, chỉ cần Python)</w:t>
+      </w:r>
+    </w:p>
+    <w:p>
+      <w:pPr>
+        <w:spacing w:after="80"/>
+      </w:pPr>
+      <w:r>
+        <w:rPr>
+          <w:b/>
+          <w:sz w:val="21"/>
+        </w:rPr>
+        <w:t>Đề xuất ưu tiên thực hiện:</w:t>
+      </w:r>
+      <w:r>
+        <w:rPr>
+          <w:sz w:val="21"/>
+        </w:rPr>
+        <w:t xml:space="preserve"> E1 → E4 (song song) → E2 → E3A → E5</w:t>
+      </w:r>
+    </w:p>
+    <w:p>
+      <w:pPr>
+        <w:spacing w:after="80"/>
+      </w:pPr>
+      <w:r>
+        <w:rPr>
+          <w:b/>
+          <w:sz w:val="21"/>
+        </w:rPr>
+        <w:t>Trạng thái đề xuất:</w:t>
+      </w:r>
+    </w:p>
+    <w:tbl>
+      <w:tblPr>
+        <w:tblStyle w:val="TableGrid"/>
+        <w:tblW w:type="auto" w:w="0"/>
+        <w:tblLook w:firstColumn="1" w:firstRow="1" w:lastColumn="0" w:lastRow="0" w:noHBand="0" w:noVBand="1" w:val="04A0"/>
+      </w:tblPr>
+      <w:tblGrid>
+        <w:gridCol w:w="3230"/>
+        <w:gridCol w:w="3230"/>
+        <w:gridCol w:w="3230"/>
+      </w:tblGrid>
+      <w:tr>
+        <w:tc>
+          <w:tcPr>
+            <w:tcW w:type="dxa" w:w="3230"/>
+            <w:shd w:val="clear" w:color="auto" w:fill="251C53"/>
+            <w:tcBorders>
+              <w:top w:val="single" w:sz="4" w:space="0" w:color="251C53"/>
+              <w:left w:val="single" w:sz="4" w:space="0" w:color="251C53"/>
+              <w:bottom w:val="single" w:sz="4" w:space="0" w:color="251C53"/>
+              <w:right w:val="single" w:sz="4" w:space="0" w:color="251C53"/>
+            </w:tcBorders>
+          </w:tcPr>
+          <w:p>
+            <w:r>
+              <w:rPr>
+                <w:b/>
+                <w:color w:val="FFFFFF"/>
+                <w:sz w:val="20"/>
+              </w:rPr>
+              <w:t>#</w:t>
+            </w:r>
+          </w:p>
+        </w:tc>
+        <w:tc>
+          <w:tcPr>
+            <w:tcW w:type="dxa" w:w="3230"/>
+            <w:shd w:val="clear" w:color="auto" w:fill="251C53"/>
+            <w:tcBorders>
+              <w:top w:val="single" w:sz="4" w:space="0" w:color="251C53"/>
+              <w:left w:val="single" w:sz="4" w:space="0" w:color="251C53"/>
+              <w:bottom w:val="single" w:sz="4" w:space="0" w:color="251C53"/>
+              <w:right w:val="single" w:sz="4" w:space="0" w:color="251C53"/>
+            </w:tcBorders>
+          </w:tcPr>
+          <w:p>
+            <w:r>
+              <w:rPr>
+                <w:b/>
+                <w:color w:val="FFFFFF"/>
+                <w:sz w:val="20"/>
+              </w:rPr>
+              <w:t>Đề xuất</w:t>
+            </w:r>
+          </w:p>
+        </w:tc>
+        <w:tc>
+          <w:tcPr>
+            <w:tcW w:type="dxa" w:w="3230"/>
+            <w:shd w:val="clear" w:color="auto" w:fill="251C53"/>
+            <w:tcBorders>
+              <w:top w:val="single" w:sz="4" w:space="0" w:color="251C53"/>
+              <w:left w:val="single" w:sz="4" w:space="0" w:color="251C53"/>
+              <w:bottom w:val="single" w:sz="4" w:space="0" w:color="251C53"/>
+              <w:right w:val="single" w:sz="4" w:space="0" w:color="251C53"/>
+            </w:tcBorders>
+          </w:tcPr>
+          <w:p>
+            <w:r>
+              <w:rPr>
+                <w:b/>
+                <w:color w:val="FFFFFF"/>
+                <w:sz w:val="20"/>
+              </w:rPr>
+              <w:t>Trạng thái</w:t>
+            </w:r>
+          </w:p>
+        </w:tc>
+      </w:tr>
+      <w:tr>
+        <w:tc>
+          <w:tcPr>
+            <w:tcW w:type="dxa" w:w="3230"/>
+            <w:tcBorders>
+              <w:top w:val="single" w:sz="4" w:space="0" w:color="CBCBCB"/>
+              <w:left w:val="single" w:sz="4" w:space="0" w:color="CBCBCB"/>
+              <w:bottom w:val="single" w:sz="4" w:space="0" w:color="CBCBCB"/>
+              <w:right w:val="single" w:sz="4" w:space="0" w:color="CBCBCB"/>
+            </w:tcBorders>
+          </w:tcPr>
+          <w:p>
+            <w:r>
+              <w:rPr>
+                <w:sz w:val="20"/>
+              </w:rPr>
+              <w:t>---</w:t>
+            </w:r>
+          </w:p>
+        </w:tc>
+        <w:tc>
+          <w:tcPr>
+            <w:tcW w:type="dxa" w:w="3230"/>
+            <w:tcBorders>
+              <w:top w:val="single" w:sz="4" w:space="0" w:color="CBCBCB"/>
+              <w:left w:val="single" w:sz="4" w:space="0" w:color="CBCBCB"/>
+              <w:bottom w:val="single" w:sz="4" w:space="0" w:color="CBCBCB"/>
+              <w:right w:val="single" w:sz="4" w:space="0" w:color="CBCBCB"/>
+            </w:tcBorders>
+          </w:tcPr>
+          <w:p>
+            <w:r>
+              <w:rPr>
+                <w:sz w:val="20"/>
+              </w:rPr>
+              <w:t>---------</w:t>
+            </w:r>
+          </w:p>
+        </w:tc>
+        <w:tc>
+          <w:tcPr>
+            <w:tcW w:type="dxa" w:w="3230"/>
+            <w:tcBorders>
+              <w:top w:val="single" w:sz="4" w:space="0" w:color="CBCBCB"/>
+              <w:left w:val="single" w:sz="4" w:space="0" w:color="CBCBCB"/>
+              <w:bottom w:val="single" w:sz="4" w:space="0" w:color="CBCBCB"/>
+              <w:right w:val="single" w:sz="4" w:space="0" w:color="CBCBCB"/>
+            </w:tcBorders>
+          </w:tcPr>
+          <w:p>
+            <w:r>
+              <w:rPr>
+                <w:sz w:val="20"/>
+              </w:rPr>
+              <w:t>-----------</w:t>
+            </w:r>
+          </w:p>
+        </w:tc>
+      </w:tr>
+      <w:tr>
+        <w:tc>
+          <w:tcPr>
+            <w:tcW w:type="dxa" w:w="3230"/>
+            <w:shd w:val="clear" w:color="auto" w:fill="B8B3D6"/>
+            <w:tcBorders>
+              <w:top w:val="single" w:sz="4" w:space="0" w:color="CBCBCB"/>
+              <w:left w:val="single" w:sz="4" w:space="0" w:color="CBCBCB"/>
+              <w:bottom w:val="single" w:sz="4" w:space="0" w:color="CBCBCB"/>
+              <w:right w:val="single" w:sz="4" w:space="0" w:color="CBCBCB"/>
+            </w:tcBorders>
+          </w:tcPr>
+          <w:p>
+            <w:r>
+              <w:rPr>
+                <w:sz w:val="20"/>
+              </w:rPr>
+              <w:t>E1</w:t>
+            </w:r>
+          </w:p>
+        </w:tc>
+        <w:tc>
+          <w:tcPr>
+            <w:tcW w:type="dxa" w:w="3230"/>
+            <w:shd w:val="clear" w:color="auto" w:fill="B8B3D6"/>
+            <w:tcBorders>
+              <w:top w:val="single" w:sz="4" w:space="0" w:color="CBCBCB"/>
+              <w:left w:val="single" w:sz="4" w:space="0" w:color="CBCBCB"/>
+              <w:bottom w:val="single" w:sz="4" w:space="0" w:color="CBCBCB"/>
+              <w:right w:val="single" w:sz="4" w:space="0" w:color="CBCBCB"/>
+            </w:tcBorders>
+          </w:tcPr>
+          <w:p>
+            <w:r>
+              <w:rPr>
+                <w:sz w:val="20"/>
+              </w:rPr>
+              <w:t>Cài skill UI UX Pro Max vào workspace</w:t>
+            </w:r>
+          </w:p>
+        </w:tc>
+        <w:tc>
+          <w:tcPr>
+            <w:tcW w:type="dxa" w:w="3230"/>
+            <w:shd w:val="clear" w:color="auto" w:fill="B8B3D6"/>
+            <w:tcBorders>
+              <w:top w:val="single" w:sz="4" w:space="0" w:color="CBCBCB"/>
+              <w:left w:val="single" w:sz="4" w:space="0" w:color="CBCBCB"/>
+              <w:bottom w:val="single" w:sz="4" w:space="0" w:color="CBCBCB"/>
+              <w:right w:val="single" w:sz="4" w:space="0" w:color="CBCBCB"/>
+            </w:tcBorders>
+          </w:tcPr>
+          <w:p>
+            <w:r>
+              <w:rPr>
+                <w:sz w:val="20"/>
+              </w:rPr>
+              <w:t>⬜ Chờ user duyệt</w:t>
+            </w:r>
+          </w:p>
+        </w:tc>
+      </w:tr>
+      <w:tr>
+        <w:tc>
+          <w:tcPr>
+            <w:tcW w:type="dxa" w:w="3230"/>
+            <w:tcBorders>
+              <w:top w:val="single" w:sz="4" w:space="0" w:color="CBCBCB"/>
+              <w:left w:val="single" w:sz="4" w:space="0" w:color="CBCBCB"/>
+              <w:bottom w:val="single" w:sz="4" w:space="0" w:color="CBCBCB"/>
+              <w:right w:val="single" w:sz="4" w:space="0" w:color="CBCBCB"/>
+            </w:tcBorders>
+          </w:tcPr>
+          <w:p>
+            <w:r>
+              <w:rPr>
+                <w:sz w:val="20"/>
+              </w:rPr>
+              <w:t>E2</w:t>
+            </w:r>
+          </w:p>
+        </w:tc>
+        <w:tc>
+          <w:tcPr>
+            <w:tcW w:type="dxa" w:w="3230"/>
+            <w:tcBorders>
+              <w:top w:val="single" w:sz="4" w:space="0" w:color="CBCBCB"/>
+              <w:left w:val="single" w:sz="4" w:space="0" w:color="CBCBCB"/>
+              <w:bottom w:val="single" w:sz="4" w:space="0" w:color="CBCBCB"/>
+              <w:right w:val="single" w:sz="4" w:space="0" w:color="CBCBCB"/>
+            </w:tcBorders>
+          </w:tcPr>
+          <w:p>
+            <w:r>
+              <w:rPr>
+                <w:sz w:val="20"/>
+              </w:rPr>
+              <w:t>Tích hợp Design System Generator vào ui-ux-designer.md</w:t>
+            </w:r>
+          </w:p>
+        </w:tc>
+        <w:tc>
+          <w:tcPr>
+            <w:tcW w:type="dxa" w:w="3230"/>
+            <w:tcBorders>
+              <w:top w:val="single" w:sz="4" w:space="0" w:color="CBCBCB"/>
+              <w:left w:val="single" w:sz="4" w:space="0" w:color="CBCBCB"/>
+              <w:bottom w:val="single" w:sz="4" w:space="0" w:color="CBCBCB"/>
+              <w:right w:val="single" w:sz="4" w:space="0" w:color="CBCBCB"/>
+            </w:tcBorders>
+          </w:tcPr>
+          <w:p>
+            <w:r>
+              <w:rPr>
+                <w:sz w:val="20"/>
+              </w:rPr>
+              <w:t>⬜ Chờ user duyệt</w:t>
+            </w:r>
+          </w:p>
+        </w:tc>
+      </w:tr>
+      <w:tr>
+        <w:tc>
+          <w:tcPr>
+            <w:tcW w:type="dxa" w:w="3230"/>
+            <w:shd w:val="clear" w:color="auto" w:fill="B8B3D6"/>
+            <w:tcBorders>
+              <w:top w:val="single" w:sz="4" w:space="0" w:color="CBCBCB"/>
+              <w:left w:val="single" w:sz="4" w:space="0" w:color="CBCBCB"/>
+              <w:bottom w:val="single" w:sz="4" w:space="0" w:color="CBCBCB"/>
+              <w:right w:val="single" w:sz="4" w:space="0" w:color="CBCBCB"/>
+            </w:tcBorders>
+          </w:tcPr>
+          <w:p>
+            <w:r>
+              <w:rPr>
+                <w:sz w:val="20"/>
+              </w:rPr>
+              <w:t>E3</w:t>
+            </w:r>
+          </w:p>
+        </w:tc>
+        <w:tc>
+          <w:tcPr>
+            <w:tcW w:type="dxa" w:w="3230"/>
+            <w:shd w:val="clear" w:color="auto" w:fill="B8B3D6"/>
+            <w:tcBorders>
+              <w:top w:val="single" w:sz="4" w:space="0" w:color="CBCBCB"/>
+              <w:left w:val="single" w:sz="4" w:space="0" w:color="CBCBCB"/>
+              <w:bottom w:val="single" w:sz="4" w:space="0" w:color="CBCBCB"/>
+              <w:right w:val="single" w:sz="4" w:space="0" w:color="CBCBCB"/>
+            </w:tcBorders>
+          </w:tcPr>
+          <w:p>
+            <w:r>
+              <w:rPr>
+                <w:sz w:val="20"/>
+              </w:rPr>
+              <w:t>Chuẩn hoá Avalonia lessons thành CSV searchable</w:t>
+            </w:r>
+          </w:p>
+        </w:tc>
+        <w:tc>
+          <w:tcPr>
+            <w:tcW w:type="dxa" w:w="3230"/>
+            <w:shd w:val="clear" w:color="auto" w:fill="B8B3D6"/>
+            <w:tcBorders>
+              <w:top w:val="single" w:sz="4" w:space="0" w:color="CBCBCB"/>
+              <w:left w:val="single" w:sz="4" w:space="0" w:color="CBCBCB"/>
+              <w:bottom w:val="single" w:sz="4" w:space="0" w:color="CBCBCB"/>
+              <w:right w:val="single" w:sz="4" w:space="0" w:color="CBCBCB"/>
+            </w:tcBorders>
+          </w:tcPr>
+          <w:p>
+            <w:r>
+              <w:rPr>
+                <w:sz w:val="20"/>
+              </w:rPr>
+              <w:t>⬜ Chờ user duyệt</w:t>
+            </w:r>
+          </w:p>
+        </w:tc>
+      </w:tr>
+      <w:tr>
+        <w:tc>
+          <w:tcPr>
+            <w:tcW w:type="dxa" w:w="3230"/>
+            <w:tcBorders>
+              <w:top w:val="single" w:sz="4" w:space="0" w:color="CBCBCB"/>
+              <w:left w:val="single" w:sz="4" w:space="0" w:color="CBCBCB"/>
+              <w:bottom w:val="single" w:sz="4" w:space="0" w:color="CBCBCB"/>
+              <w:right w:val="single" w:sz="4" w:space="0" w:color="CBCBCB"/>
+            </w:tcBorders>
+          </w:tcPr>
+          <w:p>
+            <w:r>
+              <w:rPr>
+                <w:sz w:val="20"/>
+              </w:rPr>
+              <w:t>E4</w:t>
+            </w:r>
+          </w:p>
+        </w:tc>
+        <w:tc>
+          <w:tcPr>
+            <w:tcW w:type="dxa" w:w="3230"/>
+            <w:tcBorders>
+              <w:top w:val="single" w:sz="4" w:space="0" w:color="CBCBCB"/>
+              <w:left w:val="single" w:sz="4" w:space="0" w:color="CBCBCB"/>
+              <w:bottom w:val="single" w:sz="4" w:space="0" w:color="CBCBCB"/>
+              <w:right w:val="single" w:sz="4" w:space="0" w:color="CBCBCB"/>
+            </w:tcBorders>
+          </w:tcPr>
+          <w:p>
+            <w:r>
+              <w:rPr>
+                <w:sz w:val="20"/>
+              </w:rPr>
+              <w:t>Bổ sung KZTEK brand palette vào design-system MASTER template</w:t>
+            </w:r>
+          </w:p>
+        </w:tc>
+        <w:tc>
+          <w:tcPr>
+            <w:tcW w:type="dxa" w:w="3230"/>
+            <w:tcBorders>
+              <w:top w:val="single" w:sz="4" w:space="0" w:color="CBCBCB"/>
+              <w:left w:val="single" w:sz="4" w:space="0" w:color="CBCBCB"/>
+              <w:bottom w:val="single" w:sz="4" w:space="0" w:color="CBCBCB"/>
+              <w:right w:val="single" w:sz="4" w:space="0" w:color="CBCBCB"/>
+            </w:tcBorders>
+          </w:tcPr>
+          <w:p>
+            <w:r>
+              <w:rPr>
+                <w:sz w:val="20"/>
+              </w:rPr>
+              <w:t>⬜ Chờ user duyệt</w:t>
+            </w:r>
+          </w:p>
+        </w:tc>
+      </w:tr>
+      <w:tr>
+        <w:tc>
+          <w:tcPr>
+            <w:tcW w:type="dxa" w:w="3230"/>
+            <w:shd w:val="clear" w:color="auto" w:fill="B8B3D6"/>
+            <w:tcBorders>
+              <w:top w:val="single" w:sz="4" w:space="0" w:color="CBCBCB"/>
+              <w:left w:val="single" w:sz="4" w:space="0" w:color="CBCBCB"/>
+              <w:bottom w:val="single" w:sz="4" w:space="0" w:color="CBCBCB"/>
+              <w:right w:val="single" w:sz="4" w:space="0" w:color="CBCBCB"/>
+            </w:tcBorders>
+          </w:tcPr>
+          <w:p>
+            <w:r>
+              <w:rPr>
+                <w:sz w:val="20"/>
+              </w:rPr>
+              <w:t>E5</w:t>
+            </w:r>
+          </w:p>
+        </w:tc>
+        <w:tc>
+          <w:tcPr>
+            <w:tcW w:type="dxa" w:w="3230"/>
+            <w:shd w:val="clear" w:color="auto" w:fill="B8B3D6"/>
+            <w:tcBorders>
+              <w:top w:val="single" w:sz="4" w:space="0" w:color="CBCBCB"/>
+              <w:left w:val="single" w:sz="4" w:space="0" w:color="CBCBCB"/>
+              <w:bottom w:val="single" w:sz="4" w:space="0" w:color="CBCBCB"/>
+              <w:right w:val="single" w:sz="4" w:space="0" w:color="CBCBCB"/>
+            </w:tcBorders>
+          </w:tcPr>
+          <w:p>
+            <w:r>
+              <w:rPr>
+                <w:sz w:val="20"/>
+              </w:rPr>
+              <w:t>Thêm hướng dẫn query design database vào design-taste-frontend.md</w:t>
+            </w:r>
+          </w:p>
+        </w:tc>
+        <w:tc>
+          <w:tcPr>
+            <w:tcW w:type="dxa" w:w="3230"/>
+            <w:shd w:val="clear" w:color="auto" w:fill="B8B3D6"/>
+            <w:tcBorders>
+              <w:top w:val="single" w:sz="4" w:space="0" w:color="CBCBCB"/>
+              <w:left w:val="single" w:sz="4" w:space="0" w:color="CBCBCB"/>
+              <w:bottom w:val="single" w:sz="4" w:space="0" w:color="CBCBCB"/>
+              <w:right w:val="single" w:sz="4" w:space="0" w:color="CBCBCB"/>
+            </w:tcBorders>
+          </w:tcPr>
+          <w:p>
+            <w:r>
+              <w:rPr>
+                <w:sz w:val="20"/>
+              </w:rPr>
+              <w:t>⬜ Chờ user duyệt</w:t>
+            </w:r>
+          </w:p>
+        </w:tc>
+      </w:tr>
+    </w:tbl>
+    <w:p/>
     <w:sectPr>
       <w:headerReference w:type="default" r:id="rId9"/>
       <w:footerReference w:type="default" r:id="rId10"/>

</xml_diff>